<commit_message>
feat: publish aligned Part A through same-origin gateway
</commit_message>
<xml_diff>
--- a/docs/part-a/PartA需求规格说明书.docx
+++ b/docs/part-a/PartA需求规格说明书.docx
@@ -48,7 +48,7 @@
         <w:t>版本</w:t>
       </w:r>
       <w:r>
-        <w:t xml:space="preserve"> 1.0</w:t>
+        <w:t xml:space="preserve"> 1.1</w:t>
       </w:r>
     </w:p>
     <w:p>
@@ -70,7 +70,7 @@
         <w:t>月</w:t>
       </w:r>
       <w:r>
-        <w:t xml:space="preserve"> 20 </w:t>
+        <w:t xml:space="preserve"> 21 </w:t>
       </w:r>
       <w:r>
         <w:t>日</w:t>
@@ -93,13 +93,19 @@
         <w:t xml:space="preserve"> Web </w:t>
       </w:r>
       <w:r>
-        <w:t>工作台，应用在</w:t>
+        <w:t>工作台，</w:t>
+      </w:r>
+      <w:r>
+        <w:t xml:space="preserve">Java </w:t>
+      </w:r>
+      <w:r>
+        <w:t>应用在</w:t>
       </w:r>
       <w:r>
         <w:t xml:space="preserve"> Windows </w:t>
       </w:r>
       <w:r>
-        <w:t>原生运行，数据库与私有对象存储由</w:t>
+        <w:t>原生运行，统一入口与数据服务由</w:t>
       </w:r>
       <w:r>
         <w:t xml:space="preserve"> Docker </w:t>
@@ -153,7 +159,7 @@
       <w:r>
         <w:fldChar w:fldCharType="separate"/>
       </w:r>
-      <w:hyperlink w:anchor="_Toc243418502" w:history="1">
+      <w:hyperlink w:anchor="_Toc243480903" w:history="1">
         <w:r>
           <w:rPr>
             <w:rStyle w:val="aff9"/>
@@ -187,7 +193,7 @@
             <w:noProof/>
             <w:webHidden/>
           </w:rPr>
-          <w:instrText xml:space="preserve"> PAGEREF _Toc243418502 \h </w:instrText>
+          <w:instrText xml:space="preserve"> PAGEREF _Toc243480903 \h </w:instrText>
         </w:r>
         <w:r>
           <w:rPr>
@@ -235,7 +241,7 @@
           <w14:ligatures w14:val="standardContextual"/>
         </w:rPr>
       </w:pPr>
-      <w:hyperlink w:anchor="_Toc243418503" w:history="1">
+      <w:hyperlink w:anchor="_Toc243480904" w:history="1">
         <w:r>
           <w:rPr>
             <w:rStyle w:val="aff9"/>
@@ -269,7 +275,7 @@
             <w:noProof/>
             <w:webHidden/>
           </w:rPr>
-          <w:instrText xml:space="preserve"> PAGEREF _Toc243418503 \h </w:instrText>
+          <w:instrText xml:space="preserve"> PAGEREF _Toc243480904 \h </w:instrText>
         </w:r>
         <w:r>
           <w:rPr>
@@ -317,7 +323,7 @@
           <w14:ligatures w14:val="standardContextual"/>
         </w:rPr>
       </w:pPr>
-      <w:hyperlink w:anchor="_Toc243418504" w:history="1">
+      <w:hyperlink w:anchor="_Toc243480905" w:history="1">
         <w:r>
           <w:rPr>
             <w:rStyle w:val="aff9"/>
@@ -351,7 +357,7 @@
             <w:noProof/>
             <w:webHidden/>
           </w:rPr>
-          <w:instrText xml:space="preserve"> PAGEREF _Toc243418504 \h </w:instrText>
+          <w:instrText xml:space="preserve"> PAGEREF _Toc243480905 \h </w:instrText>
         </w:r>
         <w:r>
           <w:rPr>
@@ -399,7 +405,7 @@
           <w14:ligatures w14:val="standardContextual"/>
         </w:rPr>
       </w:pPr>
-      <w:hyperlink w:anchor="_Toc243418505" w:history="1">
+      <w:hyperlink w:anchor="_Toc243480906" w:history="1">
         <w:r>
           <w:rPr>
             <w:rStyle w:val="aff9"/>
@@ -433,7 +439,7 @@
             <w:noProof/>
             <w:webHidden/>
           </w:rPr>
-          <w:instrText xml:space="preserve"> PAGEREF _Toc243418505 \h </w:instrText>
+          <w:instrText xml:space="preserve"> PAGEREF _Toc243480906 \h </w:instrText>
         </w:r>
         <w:r>
           <w:rPr>
@@ -480,7 +486,7 @@
           <w14:ligatures w14:val="standardContextual"/>
         </w:rPr>
       </w:pPr>
-      <w:hyperlink w:anchor="_Toc243418506" w:history="1">
+      <w:hyperlink w:anchor="_Toc243480907" w:history="1">
         <w:r>
           <w:rPr>
             <w:rStyle w:val="aff9"/>
@@ -514,7 +520,7 @@
             <w:noProof/>
             <w:webHidden/>
           </w:rPr>
-          <w:instrText xml:space="preserve"> PAGEREF _Toc243418506 \h </w:instrText>
+          <w:instrText xml:space="preserve"> PAGEREF _Toc243480907 \h </w:instrText>
         </w:r>
         <w:r>
           <w:rPr>
@@ -562,7 +568,7 @@
           <w14:ligatures w14:val="standardContextual"/>
         </w:rPr>
       </w:pPr>
-      <w:hyperlink w:anchor="_Toc243418507" w:history="1">
+      <w:hyperlink w:anchor="_Toc243480908" w:history="1">
         <w:r>
           <w:rPr>
             <w:rStyle w:val="aff9"/>
@@ -596,7 +602,7 @@
             <w:noProof/>
             <w:webHidden/>
           </w:rPr>
-          <w:instrText xml:space="preserve"> PAGEREF _Toc243418507 \h </w:instrText>
+          <w:instrText xml:space="preserve"> PAGEREF _Toc243480908 \h </w:instrText>
         </w:r>
         <w:r>
           <w:rPr>
@@ -644,7 +650,7 @@
           <w14:ligatures w14:val="standardContextual"/>
         </w:rPr>
       </w:pPr>
-      <w:hyperlink w:anchor="_Toc243418508" w:history="1">
+      <w:hyperlink w:anchor="_Toc243480909" w:history="1">
         <w:r>
           <w:rPr>
             <w:rStyle w:val="aff9"/>
@@ -678,7 +684,7 @@
             <w:noProof/>
             <w:webHidden/>
           </w:rPr>
-          <w:instrText xml:space="preserve"> PAGEREF _Toc243418508 \h </w:instrText>
+          <w:instrText xml:space="preserve"> PAGEREF _Toc243480909 \h </w:instrText>
         </w:r>
         <w:r>
           <w:rPr>
@@ -725,7 +731,7 @@
           <w14:ligatures w14:val="standardContextual"/>
         </w:rPr>
       </w:pPr>
-      <w:hyperlink w:anchor="_Toc243418509" w:history="1">
+      <w:hyperlink w:anchor="_Toc243480910" w:history="1">
         <w:r>
           <w:rPr>
             <w:rStyle w:val="aff9"/>
@@ -759,7 +765,7 @@
             <w:noProof/>
             <w:webHidden/>
           </w:rPr>
-          <w:instrText xml:space="preserve"> PAGEREF _Toc243418509 \h </w:instrText>
+          <w:instrText xml:space="preserve"> PAGEREF _Toc243480910 \h </w:instrText>
         </w:r>
         <w:r>
           <w:rPr>
@@ -807,7 +813,7 @@
           <w14:ligatures w14:val="standardContextual"/>
         </w:rPr>
       </w:pPr>
-      <w:hyperlink w:anchor="_Toc243418510" w:history="1">
+      <w:hyperlink w:anchor="_Toc243480911" w:history="1">
         <w:r>
           <w:rPr>
             <w:rStyle w:val="aff9"/>
@@ -841,7 +847,7 @@
             <w:noProof/>
             <w:webHidden/>
           </w:rPr>
-          <w:instrText xml:space="preserve"> PAGEREF _Toc243418510 \h </w:instrText>
+          <w:instrText xml:space="preserve"> PAGEREF _Toc243480911 \h </w:instrText>
         </w:r>
         <w:r>
           <w:rPr>
@@ -889,7 +895,7 @@
           <w14:ligatures w14:val="standardContextual"/>
         </w:rPr>
       </w:pPr>
-      <w:hyperlink w:anchor="_Toc243418511" w:history="1">
+      <w:hyperlink w:anchor="_Toc243480912" w:history="1">
         <w:r>
           <w:rPr>
             <w:rStyle w:val="aff9"/>
@@ -923,7 +929,7 @@
             <w:noProof/>
             <w:webHidden/>
           </w:rPr>
-          <w:instrText xml:space="preserve"> PAGEREF _Toc243418511 \h </w:instrText>
+          <w:instrText xml:space="preserve"> PAGEREF _Toc243480912 \h </w:instrText>
         </w:r>
         <w:r>
           <w:rPr>
@@ -971,7 +977,7 @@
           <w14:ligatures w14:val="standardContextual"/>
         </w:rPr>
       </w:pPr>
-      <w:hyperlink w:anchor="_Toc243418512" w:history="1">
+      <w:hyperlink w:anchor="_Toc243480913" w:history="1">
         <w:r>
           <w:rPr>
             <w:rStyle w:val="aff9"/>
@@ -1005,7 +1011,7 @@
             <w:noProof/>
             <w:webHidden/>
           </w:rPr>
-          <w:instrText xml:space="preserve"> PAGEREF _Toc243418512 \h </w:instrText>
+          <w:instrText xml:space="preserve"> PAGEREF _Toc243480913 \h </w:instrText>
         </w:r>
         <w:r>
           <w:rPr>
@@ -1053,7 +1059,7 @@
           <w14:ligatures w14:val="standardContextual"/>
         </w:rPr>
       </w:pPr>
-      <w:hyperlink w:anchor="_Toc243418513" w:history="1">
+      <w:hyperlink w:anchor="_Toc243480914" w:history="1">
         <w:r>
           <w:rPr>
             <w:rStyle w:val="aff9"/>
@@ -1087,7 +1093,7 @@
             <w:noProof/>
             <w:webHidden/>
           </w:rPr>
-          <w:instrText xml:space="preserve"> PAGEREF _Toc243418513 \h </w:instrText>
+          <w:instrText xml:space="preserve"> PAGEREF _Toc243480914 \h </w:instrText>
         </w:r>
         <w:r>
           <w:rPr>
@@ -1135,7 +1141,7 @@
           <w14:ligatures w14:val="standardContextual"/>
         </w:rPr>
       </w:pPr>
-      <w:hyperlink w:anchor="_Toc243418514" w:history="1">
+      <w:hyperlink w:anchor="_Toc243480915" w:history="1">
         <w:r>
           <w:rPr>
             <w:rStyle w:val="aff9"/>
@@ -1169,7 +1175,7 @@
             <w:noProof/>
             <w:webHidden/>
           </w:rPr>
-          <w:instrText xml:space="preserve"> PAGEREF _Toc243418514 \h </w:instrText>
+          <w:instrText xml:space="preserve"> PAGEREF _Toc243480915 \h </w:instrText>
         </w:r>
         <w:r>
           <w:rPr>
@@ -1217,7 +1223,7 @@
           <w14:ligatures w14:val="standardContextual"/>
         </w:rPr>
       </w:pPr>
-      <w:hyperlink w:anchor="_Toc243418515" w:history="1">
+      <w:hyperlink w:anchor="_Toc243480916" w:history="1">
         <w:r>
           <w:rPr>
             <w:rStyle w:val="aff9"/>
@@ -1251,7 +1257,7 @@
             <w:noProof/>
             <w:webHidden/>
           </w:rPr>
-          <w:instrText xml:space="preserve"> PAGEREF _Toc243418515 \h </w:instrText>
+          <w:instrText xml:space="preserve"> PAGEREF _Toc243480916 \h </w:instrText>
         </w:r>
         <w:r>
           <w:rPr>
@@ -1299,7 +1305,7 @@
           <w14:ligatures w14:val="standardContextual"/>
         </w:rPr>
       </w:pPr>
-      <w:hyperlink w:anchor="_Toc243418516" w:history="1">
+      <w:hyperlink w:anchor="_Toc243480917" w:history="1">
         <w:r>
           <w:rPr>
             <w:rStyle w:val="aff9"/>
@@ -1333,7 +1339,7 @@
             <w:noProof/>
             <w:webHidden/>
           </w:rPr>
-          <w:instrText xml:space="preserve"> PAGEREF _Toc243418516 \h </w:instrText>
+          <w:instrText xml:space="preserve"> PAGEREF _Toc243480917 \h </w:instrText>
         </w:r>
         <w:r>
           <w:rPr>
@@ -1381,7 +1387,7 @@
           <w14:ligatures w14:val="standardContextual"/>
         </w:rPr>
       </w:pPr>
-      <w:hyperlink w:anchor="_Toc243418517" w:history="1">
+      <w:hyperlink w:anchor="_Toc243480918" w:history="1">
         <w:r>
           <w:rPr>
             <w:rStyle w:val="aff9"/>
@@ -1415,7 +1421,7 @@
             <w:noProof/>
             <w:webHidden/>
           </w:rPr>
-          <w:instrText xml:space="preserve"> PAGEREF _Toc243418517 \h </w:instrText>
+          <w:instrText xml:space="preserve"> PAGEREF _Toc243480918 \h </w:instrText>
         </w:r>
         <w:r>
           <w:rPr>
@@ -1463,7 +1469,7 @@
           <w14:ligatures w14:val="standardContextual"/>
         </w:rPr>
       </w:pPr>
-      <w:hyperlink w:anchor="_Toc243418518" w:history="1">
+      <w:hyperlink w:anchor="_Toc243480919" w:history="1">
         <w:r>
           <w:rPr>
             <w:rStyle w:val="aff9"/>
@@ -1497,7 +1503,7 @@
             <w:noProof/>
             <w:webHidden/>
           </w:rPr>
-          <w:instrText xml:space="preserve"> PAGEREF _Toc243418518 \h </w:instrText>
+          <w:instrText xml:space="preserve"> PAGEREF _Toc243480919 \h </w:instrText>
         </w:r>
         <w:r>
           <w:rPr>
@@ -1545,7 +1551,7 @@
           <w14:ligatures w14:val="standardContextual"/>
         </w:rPr>
       </w:pPr>
-      <w:hyperlink w:anchor="_Toc243418519" w:history="1">
+      <w:hyperlink w:anchor="_Toc243480920" w:history="1">
         <w:r>
           <w:rPr>
             <w:rStyle w:val="aff9"/>
@@ -1579,7 +1585,7 @@
             <w:noProof/>
             <w:webHidden/>
           </w:rPr>
-          <w:instrText xml:space="preserve"> PAGEREF _Toc243418519 \h </w:instrText>
+          <w:instrText xml:space="preserve"> PAGEREF _Toc243480920 \h </w:instrText>
         </w:r>
         <w:r>
           <w:rPr>
@@ -1627,7 +1633,7 @@
           <w14:ligatures w14:val="standardContextual"/>
         </w:rPr>
       </w:pPr>
-      <w:hyperlink w:anchor="_Toc243418520" w:history="1">
+      <w:hyperlink w:anchor="_Toc243480921" w:history="1">
         <w:r>
           <w:rPr>
             <w:rStyle w:val="aff9"/>
@@ -1661,7 +1667,7 @@
             <w:noProof/>
             <w:webHidden/>
           </w:rPr>
-          <w:instrText xml:space="preserve"> PAGEREF _Toc243418520 \h </w:instrText>
+          <w:instrText xml:space="preserve"> PAGEREF _Toc243480921 \h </w:instrText>
         </w:r>
         <w:r>
           <w:rPr>
@@ -1709,7 +1715,7 @@
           <w14:ligatures w14:val="standardContextual"/>
         </w:rPr>
       </w:pPr>
-      <w:hyperlink w:anchor="_Toc243418521" w:history="1">
+      <w:hyperlink w:anchor="_Toc243480922" w:history="1">
         <w:r>
           <w:rPr>
             <w:rStyle w:val="aff9"/>
@@ -1743,7 +1749,7 @@
             <w:noProof/>
             <w:webHidden/>
           </w:rPr>
-          <w:instrText xml:space="preserve"> PAGEREF _Toc243418521 \h </w:instrText>
+          <w:instrText xml:space="preserve"> PAGEREF _Toc243480922 \h </w:instrText>
         </w:r>
         <w:r>
           <w:rPr>
@@ -1791,7 +1797,7 @@
           <w14:ligatures w14:val="standardContextual"/>
         </w:rPr>
       </w:pPr>
-      <w:hyperlink w:anchor="_Toc243418522" w:history="1">
+      <w:hyperlink w:anchor="_Toc243480923" w:history="1">
         <w:r>
           <w:rPr>
             <w:rStyle w:val="aff9"/>
@@ -1825,7 +1831,7 @@
             <w:noProof/>
             <w:webHidden/>
           </w:rPr>
-          <w:instrText xml:space="preserve"> PAGEREF _Toc243418522 \h </w:instrText>
+          <w:instrText xml:space="preserve"> PAGEREF _Toc243480923 \h </w:instrText>
         </w:r>
         <w:r>
           <w:rPr>
@@ -1873,7 +1879,7 @@
           <w14:ligatures w14:val="standardContextual"/>
         </w:rPr>
       </w:pPr>
-      <w:hyperlink w:anchor="_Toc243418523" w:history="1">
+      <w:hyperlink w:anchor="_Toc243480924" w:history="1">
         <w:r>
           <w:rPr>
             <w:rStyle w:val="aff9"/>
@@ -1907,7 +1913,7 @@
             <w:noProof/>
             <w:webHidden/>
           </w:rPr>
-          <w:instrText xml:space="preserve"> PAGEREF _Toc243418523 \h </w:instrText>
+          <w:instrText xml:space="preserve"> PAGEREF _Toc243480924 \h </w:instrText>
         </w:r>
         <w:r>
           <w:rPr>
@@ -1955,7 +1961,7 @@
           <w14:ligatures w14:val="standardContextual"/>
         </w:rPr>
       </w:pPr>
-      <w:hyperlink w:anchor="_Toc243418524" w:history="1">
+      <w:hyperlink w:anchor="_Toc243480925" w:history="1">
         <w:r>
           <w:rPr>
             <w:rStyle w:val="aff9"/>
@@ -1989,7 +1995,7 @@
             <w:noProof/>
             <w:webHidden/>
           </w:rPr>
-          <w:instrText xml:space="preserve"> PAGEREF _Toc243418524 \h </w:instrText>
+          <w:instrText xml:space="preserve"> PAGEREF _Toc243480925 \h </w:instrText>
         </w:r>
         <w:r>
           <w:rPr>
@@ -2037,7 +2043,7 @@
           <w14:ligatures w14:val="standardContextual"/>
         </w:rPr>
       </w:pPr>
-      <w:hyperlink w:anchor="_Toc243418525" w:history="1">
+      <w:hyperlink w:anchor="_Toc243480926" w:history="1">
         <w:r>
           <w:rPr>
             <w:rStyle w:val="aff9"/>
@@ -2071,7 +2077,7 @@
             <w:noProof/>
             <w:webHidden/>
           </w:rPr>
-          <w:instrText xml:space="preserve"> PAGEREF _Toc243418525 \h </w:instrText>
+          <w:instrText xml:space="preserve"> PAGEREF _Toc243480926 \h </w:instrText>
         </w:r>
         <w:r>
           <w:rPr>
@@ -2119,7 +2125,7 @@
           <w14:ligatures w14:val="standardContextual"/>
         </w:rPr>
       </w:pPr>
-      <w:hyperlink w:anchor="_Toc243418526" w:history="1">
+      <w:hyperlink w:anchor="_Toc243480927" w:history="1">
         <w:r>
           <w:rPr>
             <w:rStyle w:val="aff9"/>
@@ -2153,7 +2159,7 @@
             <w:noProof/>
             <w:webHidden/>
           </w:rPr>
-          <w:instrText xml:space="preserve"> PAGEREF _Toc243418526 \h </w:instrText>
+          <w:instrText xml:space="preserve"> PAGEREF _Toc243480927 \h </w:instrText>
         </w:r>
         <w:r>
           <w:rPr>
@@ -2201,7 +2207,7 @@
           <w14:ligatures w14:val="standardContextual"/>
         </w:rPr>
       </w:pPr>
-      <w:hyperlink w:anchor="_Toc243418527" w:history="1">
+      <w:hyperlink w:anchor="_Toc243480928" w:history="1">
         <w:r>
           <w:rPr>
             <w:rStyle w:val="aff9"/>
@@ -2235,7 +2241,7 @@
             <w:noProof/>
             <w:webHidden/>
           </w:rPr>
-          <w:instrText xml:space="preserve"> PAGEREF _Toc243418527 \h </w:instrText>
+          <w:instrText xml:space="preserve"> PAGEREF _Toc243480928 \h </w:instrText>
         </w:r>
         <w:r>
           <w:rPr>
@@ -2283,7 +2289,7 @@
           <w14:ligatures w14:val="standardContextual"/>
         </w:rPr>
       </w:pPr>
-      <w:hyperlink w:anchor="_Toc243418528" w:history="1">
+      <w:hyperlink w:anchor="_Toc243480929" w:history="1">
         <w:r>
           <w:rPr>
             <w:rStyle w:val="aff9"/>
@@ -2317,7 +2323,7 @@
             <w:noProof/>
             <w:webHidden/>
           </w:rPr>
-          <w:instrText xml:space="preserve"> PAGEREF _Toc243418528 \h </w:instrText>
+          <w:instrText xml:space="preserve"> PAGEREF _Toc243480929 \h </w:instrText>
         </w:r>
         <w:r>
           <w:rPr>
@@ -2365,7 +2371,7 @@
           <w14:ligatures w14:val="standardContextual"/>
         </w:rPr>
       </w:pPr>
-      <w:hyperlink w:anchor="_Toc243418529" w:history="1">
+      <w:hyperlink w:anchor="_Toc243480930" w:history="1">
         <w:r>
           <w:rPr>
             <w:rStyle w:val="aff9"/>
@@ -2399,7 +2405,7 @@
             <w:noProof/>
             <w:webHidden/>
           </w:rPr>
-          <w:instrText xml:space="preserve"> PAGEREF _Toc243418529 \h </w:instrText>
+          <w:instrText xml:space="preserve"> PAGEREF _Toc243480930 \h </w:instrText>
         </w:r>
         <w:r>
           <w:rPr>
@@ -2447,7 +2453,7 @@
           <w14:ligatures w14:val="standardContextual"/>
         </w:rPr>
       </w:pPr>
-      <w:hyperlink w:anchor="_Toc243418530" w:history="1">
+      <w:hyperlink w:anchor="_Toc243480931" w:history="1">
         <w:r>
           <w:rPr>
             <w:rStyle w:val="aff9"/>
@@ -2481,7 +2487,7 @@
             <w:noProof/>
             <w:webHidden/>
           </w:rPr>
-          <w:instrText xml:space="preserve"> PAGEREF _Toc243418530 \h </w:instrText>
+          <w:instrText xml:space="preserve"> PAGEREF _Toc243480931 \h </w:instrText>
         </w:r>
         <w:r>
           <w:rPr>
@@ -2529,7 +2535,7 @@
           <w14:ligatures w14:val="standardContextual"/>
         </w:rPr>
       </w:pPr>
-      <w:hyperlink w:anchor="_Toc243418531" w:history="1">
+      <w:hyperlink w:anchor="_Toc243480932" w:history="1">
         <w:r>
           <w:rPr>
             <w:rStyle w:val="aff9"/>
@@ -2563,7 +2569,7 @@
             <w:noProof/>
             <w:webHidden/>
           </w:rPr>
-          <w:instrText xml:space="preserve"> PAGEREF _Toc243418531 \h </w:instrText>
+          <w:instrText xml:space="preserve"> PAGEREF _Toc243480932 \h </w:instrText>
         </w:r>
         <w:r>
           <w:rPr>
@@ -2611,7 +2617,7 @@
           <w14:ligatures w14:val="standardContextual"/>
         </w:rPr>
       </w:pPr>
-      <w:hyperlink w:anchor="_Toc243418532" w:history="1">
+      <w:hyperlink w:anchor="_Toc243480933" w:history="1">
         <w:r>
           <w:rPr>
             <w:rStyle w:val="aff9"/>
@@ -2645,7 +2651,7 @@
             <w:noProof/>
             <w:webHidden/>
           </w:rPr>
-          <w:instrText xml:space="preserve"> PAGEREF _Toc243418532 \h </w:instrText>
+          <w:instrText xml:space="preserve"> PAGEREF _Toc243480933 \h </w:instrText>
         </w:r>
         <w:r>
           <w:rPr>
@@ -2692,7 +2698,7 @@
           <w14:ligatures w14:val="standardContextual"/>
         </w:rPr>
       </w:pPr>
-      <w:hyperlink w:anchor="_Toc243418533" w:history="1">
+      <w:hyperlink w:anchor="_Toc243480934" w:history="1">
         <w:r>
           <w:rPr>
             <w:rStyle w:val="aff9"/>
@@ -2726,7 +2732,7 @@
             <w:noProof/>
             <w:webHidden/>
           </w:rPr>
-          <w:instrText xml:space="preserve"> PAGEREF _Toc243418533 \h </w:instrText>
+          <w:instrText xml:space="preserve"> PAGEREF _Toc243480934 \h </w:instrText>
         </w:r>
         <w:r>
           <w:rPr>
@@ -2774,7 +2780,7 @@
           <w14:ligatures w14:val="standardContextual"/>
         </w:rPr>
       </w:pPr>
-      <w:hyperlink w:anchor="_Toc243418534" w:history="1">
+      <w:hyperlink w:anchor="_Toc243480935" w:history="1">
         <w:r>
           <w:rPr>
             <w:rStyle w:val="aff9"/>
@@ -2808,7 +2814,7 @@
             <w:noProof/>
             <w:webHidden/>
           </w:rPr>
-          <w:instrText xml:space="preserve"> PAGEREF _Toc243418534 \h </w:instrText>
+          <w:instrText xml:space="preserve"> PAGEREF _Toc243480935 \h </w:instrText>
         </w:r>
         <w:r>
           <w:rPr>
@@ -2856,7 +2862,7 @@
           <w14:ligatures w14:val="standardContextual"/>
         </w:rPr>
       </w:pPr>
-      <w:hyperlink w:anchor="_Toc243418535" w:history="1">
+      <w:hyperlink w:anchor="_Toc243480936" w:history="1">
         <w:r>
           <w:rPr>
             <w:rStyle w:val="aff9"/>
@@ -2890,7 +2896,7 @@
             <w:noProof/>
             <w:webHidden/>
           </w:rPr>
-          <w:instrText xml:space="preserve"> PAGEREF _Toc243418535 \h </w:instrText>
+          <w:instrText xml:space="preserve"> PAGEREF _Toc243480936 \h </w:instrText>
         </w:r>
         <w:r>
           <w:rPr>
@@ -2938,7 +2944,7 @@
           <w14:ligatures w14:val="standardContextual"/>
         </w:rPr>
       </w:pPr>
-      <w:hyperlink w:anchor="_Toc243418536" w:history="1">
+      <w:hyperlink w:anchor="_Toc243480937" w:history="1">
         <w:r>
           <w:rPr>
             <w:rStyle w:val="aff9"/>
@@ -2972,7 +2978,7 @@
             <w:noProof/>
             <w:webHidden/>
           </w:rPr>
-          <w:instrText xml:space="preserve"> PAGEREF _Toc243418536 \h </w:instrText>
+          <w:instrText xml:space="preserve"> PAGEREF _Toc243480937 \h </w:instrText>
         </w:r>
         <w:r>
           <w:rPr>
@@ -3019,7 +3025,7 @@
           <w14:ligatures w14:val="standardContextual"/>
         </w:rPr>
       </w:pPr>
-      <w:hyperlink w:anchor="_Toc243418537" w:history="1">
+      <w:hyperlink w:anchor="_Toc243480938" w:history="1">
         <w:r>
           <w:rPr>
             <w:rStyle w:val="aff9"/>
@@ -3053,7 +3059,7 @@
             <w:noProof/>
             <w:webHidden/>
           </w:rPr>
-          <w:instrText xml:space="preserve"> PAGEREF _Toc243418537 \h </w:instrText>
+          <w:instrText xml:space="preserve"> PAGEREF _Toc243480938 \h </w:instrText>
         </w:r>
         <w:r>
           <w:rPr>
@@ -3101,7 +3107,7 @@
           <w14:ligatures w14:val="standardContextual"/>
         </w:rPr>
       </w:pPr>
-      <w:hyperlink w:anchor="_Toc243418538" w:history="1">
+      <w:hyperlink w:anchor="_Toc243480939" w:history="1">
         <w:r>
           <w:rPr>
             <w:rStyle w:val="aff9"/>
@@ -3135,7 +3141,7 @@
             <w:noProof/>
             <w:webHidden/>
           </w:rPr>
-          <w:instrText xml:space="preserve"> PAGEREF _Toc243418538 \h </w:instrText>
+          <w:instrText xml:space="preserve"> PAGEREF _Toc243480939 \h </w:instrText>
         </w:r>
         <w:r>
           <w:rPr>
@@ -3183,7 +3189,7 @@
           <w14:ligatures w14:val="standardContextual"/>
         </w:rPr>
       </w:pPr>
-      <w:hyperlink w:anchor="_Toc243418539" w:history="1">
+      <w:hyperlink w:anchor="_Toc243480940" w:history="1">
         <w:r>
           <w:rPr>
             <w:rStyle w:val="aff9"/>
@@ -3217,7 +3223,7 @@
             <w:noProof/>
             <w:webHidden/>
           </w:rPr>
-          <w:instrText xml:space="preserve"> PAGEREF _Toc243418539 \h </w:instrText>
+          <w:instrText xml:space="preserve"> PAGEREF _Toc243480940 \h </w:instrText>
         </w:r>
         <w:r>
           <w:rPr>
@@ -3237,7 +3243,7 @@
             <w:noProof/>
             <w:webHidden/>
           </w:rPr>
-          <w:t>19</w:t>
+          <w:t>20</w:t>
         </w:r>
         <w:r>
           <w:rPr>
@@ -3265,7 +3271,7 @@
           <w14:ligatures w14:val="standardContextual"/>
         </w:rPr>
       </w:pPr>
-      <w:hyperlink w:anchor="_Toc243418540" w:history="1">
+      <w:hyperlink w:anchor="_Toc243480941" w:history="1">
         <w:r>
           <w:rPr>
             <w:rStyle w:val="aff9"/>
@@ -3299,7 +3305,7 @@
             <w:noProof/>
             <w:webHidden/>
           </w:rPr>
-          <w:instrText xml:space="preserve"> PAGEREF _Toc243418540 \h </w:instrText>
+          <w:instrText xml:space="preserve"> PAGEREF _Toc243480941 \h </w:instrText>
         </w:r>
         <w:r>
           <w:rPr>
@@ -3319,7 +3325,7 @@
             <w:noProof/>
             <w:webHidden/>
           </w:rPr>
-          <w:t>20</w:t>
+          <w:t>21</w:t>
         </w:r>
         <w:r>
           <w:rPr>
@@ -3346,7 +3352,7 @@
           <w14:ligatures w14:val="standardContextual"/>
         </w:rPr>
       </w:pPr>
-      <w:hyperlink w:anchor="_Toc243418541" w:history="1">
+      <w:hyperlink w:anchor="_Toc243480942" w:history="1">
         <w:r>
           <w:rPr>
             <w:rStyle w:val="aff9"/>
@@ -3380,7 +3386,7 @@
             <w:noProof/>
             <w:webHidden/>
           </w:rPr>
-          <w:instrText xml:space="preserve"> PAGEREF _Toc243418541 \h </w:instrText>
+          <w:instrText xml:space="preserve"> PAGEREF _Toc243480942 \h </w:instrText>
         </w:r>
         <w:r>
           <w:rPr>
@@ -3400,7 +3406,7 @@
             <w:noProof/>
             <w:webHidden/>
           </w:rPr>
-          <w:t>21</w:t>
+          <w:t>22</w:t>
         </w:r>
         <w:r>
           <w:rPr>
@@ -3428,7 +3434,7 @@
           <w14:ligatures w14:val="standardContextual"/>
         </w:rPr>
       </w:pPr>
-      <w:hyperlink w:anchor="_Toc243418542" w:history="1">
+      <w:hyperlink w:anchor="_Toc243480943" w:history="1">
         <w:r>
           <w:rPr>
             <w:rStyle w:val="aff9"/>
@@ -3462,7 +3468,7 @@
             <w:noProof/>
             <w:webHidden/>
           </w:rPr>
-          <w:instrText xml:space="preserve"> PAGEREF _Toc243418542 \h </w:instrText>
+          <w:instrText xml:space="preserve"> PAGEREF _Toc243480943 \h </w:instrText>
         </w:r>
         <w:r>
           <w:rPr>
@@ -3482,7 +3488,7 @@
             <w:noProof/>
             <w:webHidden/>
           </w:rPr>
-          <w:t>21</w:t>
+          <w:t>22</w:t>
         </w:r>
         <w:r>
           <w:rPr>
@@ -3510,7 +3516,7 @@
           <w14:ligatures w14:val="standardContextual"/>
         </w:rPr>
       </w:pPr>
-      <w:hyperlink w:anchor="_Toc243418543" w:history="1">
+      <w:hyperlink w:anchor="_Toc243480944" w:history="1">
         <w:r>
           <w:rPr>
             <w:rStyle w:val="aff9"/>
@@ -3544,7 +3550,7 @@
             <w:noProof/>
             <w:webHidden/>
           </w:rPr>
-          <w:instrText xml:space="preserve"> PAGEREF _Toc243418543 \h </w:instrText>
+          <w:instrText xml:space="preserve"> PAGEREF _Toc243480944 \h </w:instrText>
         </w:r>
         <w:r>
           <w:rPr>
@@ -3564,7 +3570,7 @@
             <w:noProof/>
             <w:webHidden/>
           </w:rPr>
-          <w:t>22</w:t>
+          <w:t>23</w:t>
         </w:r>
         <w:r>
           <w:rPr>
@@ -3592,7 +3598,7 @@
           <w14:ligatures w14:val="standardContextual"/>
         </w:rPr>
       </w:pPr>
-      <w:hyperlink w:anchor="_Toc243418544" w:history="1">
+      <w:hyperlink w:anchor="_Toc243480945" w:history="1">
         <w:r>
           <w:rPr>
             <w:rStyle w:val="aff9"/>
@@ -3626,7 +3632,7 @@
             <w:noProof/>
             <w:webHidden/>
           </w:rPr>
-          <w:instrText xml:space="preserve"> PAGEREF _Toc243418544 \h </w:instrText>
+          <w:instrText xml:space="preserve"> PAGEREF _Toc243480945 \h </w:instrText>
         </w:r>
         <w:r>
           <w:rPr>
@@ -3646,7 +3652,7 @@
             <w:noProof/>
             <w:webHidden/>
           </w:rPr>
-          <w:t>23</w:t>
+          <w:t>24</w:t>
         </w:r>
         <w:r>
           <w:rPr>
@@ -3674,7 +3680,7 @@
           <w14:ligatures w14:val="standardContextual"/>
         </w:rPr>
       </w:pPr>
-      <w:hyperlink w:anchor="_Toc243418545" w:history="1">
+      <w:hyperlink w:anchor="_Toc243480946" w:history="1">
         <w:r>
           <w:rPr>
             <w:rStyle w:val="aff9"/>
@@ -3708,7 +3714,7 @@
             <w:noProof/>
             <w:webHidden/>
           </w:rPr>
-          <w:instrText xml:space="preserve"> PAGEREF _Toc243418545 \h </w:instrText>
+          <w:instrText xml:space="preserve"> PAGEREF _Toc243480946 \h </w:instrText>
         </w:r>
         <w:r>
           <w:rPr>
@@ -3728,7 +3734,7 @@
             <w:noProof/>
             <w:webHidden/>
           </w:rPr>
-          <w:t>24</w:t>
+          <w:t>25</w:t>
         </w:r>
         <w:r>
           <w:rPr>
@@ -3756,7 +3762,7 @@
           <w14:ligatures w14:val="standardContextual"/>
         </w:rPr>
       </w:pPr>
-      <w:hyperlink w:anchor="_Toc243418546" w:history="1">
+      <w:hyperlink w:anchor="_Toc243480947" w:history="1">
         <w:r>
           <w:rPr>
             <w:rStyle w:val="aff9"/>
@@ -3790,7 +3796,7 @@
             <w:noProof/>
             <w:webHidden/>
           </w:rPr>
-          <w:instrText xml:space="preserve"> PAGEREF _Toc243418546 \h </w:instrText>
+          <w:instrText xml:space="preserve"> PAGEREF _Toc243480947 \h </w:instrText>
         </w:r>
         <w:r>
           <w:rPr>
@@ -3810,7 +3816,7 @@
             <w:noProof/>
             <w:webHidden/>
           </w:rPr>
-          <w:t>25</w:t>
+          <w:t>26</w:t>
         </w:r>
         <w:r>
           <w:rPr>
@@ -3838,7 +3844,7 @@
           <w14:ligatures w14:val="standardContextual"/>
         </w:rPr>
       </w:pPr>
-      <w:hyperlink w:anchor="_Toc243418547" w:history="1">
+      <w:hyperlink w:anchor="_Toc243480948" w:history="1">
         <w:r>
           <w:rPr>
             <w:rStyle w:val="aff9"/>
@@ -3872,7 +3878,7 @@
             <w:noProof/>
             <w:webHidden/>
           </w:rPr>
-          <w:instrText xml:space="preserve"> PAGEREF _Toc243418547 \h </w:instrText>
+          <w:instrText xml:space="preserve"> PAGEREF _Toc243480948 \h </w:instrText>
         </w:r>
         <w:r>
           <w:rPr>
@@ -3892,7 +3898,7 @@
             <w:noProof/>
             <w:webHidden/>
           </w:rPr>
-          <w:t>26</w:t>
+          <w:t>27</w:t>
         </w:r>
         <w:r>
           <w:rPr>
@@ -3919,7 +3925,7 @@
           <w14:ligatures w14:val="standardContextual"/>
         </w:rPr>
       </w:pPr>
-      <w:hyperlink w:anchor="_Toc243418548" w:history="1">
+      <w:hyperlink w:anchor="_Toc243480949" w:history="1">
         <w:r>
           <w:rPr>
             <w:rStyle w:val="aff9"/>
@@ -3953,7 +3959,7 @@
             <w:noProof/>
             <w:webHidden/>
           </w:rPr>
-          <w:instrText xml:space="preserve"> PAGEREF _Toc243418548 \h </w:instrText>
+          <w:instrText xml:space="preserve"> PAGEREF _Toc243480949 \h </w:instrText>
         </w:r>
         <w:r>
           <w:rPr>
@@ -3973,7 +3979,7 @@
             <w:noProof/>
             <w:webHidden/>
           </w:rPr>
-          <w:t>27</w:t>
+          <w:t>28</w:t>
         </w:r>
         <w:r>
           <w:rPr>
@@ -4001,7 +4007,7 @@
           <w14:ligatures w14:val="standardContextual"/>
         </w:rPr>
       </w:pPr>
-      <w:hyperlink w:anchor="_Toc243418549" w:history="1">
+      <w:hyperlink w:anchor="_Toc243480950" w:history="1">
         <w:r>
           <w:rPr>
             <w:rStyle w:val="aff9"/>
@@ -4035,7 +4041,7 @@
             <w:noProof/>
             <w:webHidden/>
           </w:rPr>
-          <w:instrText xml:space="preserve"> PAGEREF _Toc243418549 \h </w:instrText>
+          <w:instrText xml:space="preserve"> PAGEREF _Toc243480950 \h </w:instrText>
         </w:r>
         <w:r>
           <w:rPr>
@@ -4055,7 +4061,7 @@
             <w:noProof/>
             <w:webHidden/>
           </w:rPr>
-          <w:t>27</w:t>
+          <w:t>28</w:t>
         </w:r>
         <w:r>
           <w:rPr>
@@ -4083,7 +4089,7 @@
           <w14:ligatures w14:val="standardContextual"/>
         </w:rPr>
       </w:pPr>
-      <w:hyperlink w:anchor="_Toc243418550" w:history="1">
+      <w:hyperlink w:anchor="_Toc243480951" w:history="1">
         <w:r>
           <w:rPr>
             <w:rStyle w:val="aff9"/>
@@ -4117,7 +4123,7 @@
             <w:noProof/>
             <w:webHidden/>
           </w:rPr>
-          <w:instrText xml:space="preserve"> PAGEREF _Toc243418550 \h </w:instrText>
+          <w:instrText xml:space="preserve"> PAGEREF _Toc243480951 \h </w:instrText>
         </w:r>
         <w:r>
           <w:rPr>
@@ -4137,7 +4143,7 @@
             <w:noProof/>
             <w:webHidden/>
           </w:rPr>
-          <w:t>28</w:t>
+          <w:t>29</w:t>
         </w:r>
         <w:r>
           <w:rPr>
@@ -4165,7 +4171,7 @@
           <w14:ligatures w14:val="standardContextual"/>
         </w:rPr>
       </w:pPr>
-      <w:hyperlink w:anchor="_Toc243418551" w:history="1">
+      <w:hyperlink w:anchor="_Toc243480952" w:history="1">
         <w:r>
           <w:rPr>
             <w:rStyle w:val="aff9"/>
@@ -4199,7 +4205,7 @@
             <w:noProof/>
             <w:webHidden/>
           </w:rPr>
-          <w:instrText xml:space="preserve"> PAGEREF _Toc243418551 \h </w:instrText>
+          <w:instrText xml:space="preserve"> PAGEREF _Toc243480952 \h </w:instrText>
         </w:r>
         <w:r>
           <w:rPr>
@@ -4219,7 +4225,7 @@
             <w:noProof/>
             <w:webHidden/>
           </w:rPr>
-          <w:t>29</w:t>
+          <w:t>30</w:t>
         </w:r>
         <w:r>
           <w:rPr>
@@ -4247,7 +4253,7 @@
           <w14:ligatures w14:val="standardContextual"/>
         </w:rPr>
       </w:pPr>
-      <w:hyperlink w:anchor="_Toc243418552" w:history="1">
+      <w:hyperlink w:anchor="_Toc243480953" w:history="1">
         <w:r>
           <w:rPr>
             <w:rStyle w:val="aff9"/>
@@ -4281,7 +4287,7 @@
             <w:noProof/>
             <w:webHidden/>
           </w:rPr>
-          <w:instrText xml:space="preserve"> PAGEREF _Toc243418552 \h </w:instrText>
+          <w:instrText xml:space="preserve"> PAGEREF _Toc243480953 \h </w:instrText>
         </w:r>
         <w:r>
           <w:rPr>
@@ -4301,7 +4307,7 @@
             <w:noProof/>
             <w:webHidden/>
           </w:rPr>
-          <w:t>30</w:t>
+          <w:t>31</w:t>
         </w:r>
         <w:r>
           <w:rPr>
@@ -4328,7 +4334,7 @@
           <w14:ligatures w14:val="standardContextual"/>
         </w:rPr>
       </w:pPr>
-      <w:hyperlink w:anchor="_Toc243418553" w:history="1">
+      <w:hyperlink w:anchor="_Toc243480954" w:history="1">
         <w:r>
           <w:rPr>
             <w:rStyle w:val="aff9"/>
@@ -4376,7 +4382,7 @@
             <w:noProof/>
             <w:webHidden/>
           </w:rPr>
-          <w:instrText xml:space="preserve"> PAGEREF _Toc243418553 \h </w:instrText>
+          <w:instrText xml:space="preserve"> PAGEREF _Toc243480954 \h </w:instrText>
         </w:r>
         <w:r>
           <w:rPr>
@@ -4396,7 +4402,7 @@
             <w:noProof/>
             <w:webHidden/>
           </w:rPr>
-          <w:t>31</w:t>
+          <w:t>32</w:t>
         </w:r>
         <w:r>
           <w:rPr>
@@ -4424,7 +4430,7 @@
           <w14:ligatures w14:val="standardContextual"/>
         </w:rPr>
       </w:pPr>
-      <w:hyperlink w:anchor="_Toc243418554" w:history="1">
+      <w:hyperlink w:anchor="_Toc243480955" w:history="1">
         <w:r>
           <w:rPr>
             <w:rStyle w:val="aff9"/>
@@ -4458,7 +4464,7 @@
             <w:noProof/>
             <w:webHidden/>
           </w:rPr>
-          <w:instrText xml:space="preserve"> PAGEREF _Toc243418554 \h </w:instrText>
+          <w:instrText xml:space="preserve"> PAGEREF _Toc243480955 \h </w:instrText>
         </w:r>
         <w:r>
           <w:rPr>
@@ -4478,7 +4484,7 @@
             <w:noProof/>
             <w:webHidden/>
           </w:rPr>
-          <w:t>31</w:t>
+          <w:t>32</w:t>
         </w:r>
         <w:r>
           <w:rPr>
@@ -4506,7 +4512,7 @@
           <w14:ligatures w14:val="standardContextual"/>
         </w:rPr>
       </w:pPr>
-      <w:hyperlink w:anchor="_Toc243418555" w:history="1">
+      <w:hyperlink w:anchor="_Toc243480956" w:history="1">
         <w:r>
           <w:rPr>
             <w:rStyle w:val="aff9"/>
@@ -4540,7 +4546,7 @@
             <w:noProof/>
             <w:webHidden/>
           </w:rPr>
-          <w:instrText xml:space="preserve"> PAGEREF _Toc243418555 \h </w:instrText>
+          <w:instrText xml:space="preserve"> PAGEREF _Toc243480956 \h </w:instrText>
         </w:r>
         <w:r>
           <w:rPr>
@@ -4560,7 +4566,7 @@
             <w:noProof/>
             <w:webHidden/>
           </w:rPr>
-          <w:t>31</w:t>
+          <w:t>32</w:t>
         </w:r>
         <w:r>
           <w:rPr>
@@ -4588,7 +4594,7 @@
           <w14:ligatures w14:val="standardContextual"/>
         </w:rPr>
       </w:pPr>
-      <w:hyperlink w:anchor="_Toc243418556" w:history="1">
+      <w:hyperlink w:anchor="_Toc243480957" w:history="1">
         <w:r>
           <w:rPr>
             <w:rStyle w:val="aff9"/>
@@ -4622,7 +4628,7 @@
             <w:noProof/>
             <w:webHidden/>
           </w:rPr>
-          <w:instrText xml:space="preserve"> PAGEREF _Toc243418556 \h </w:instrText>
+          <w:instrText xml:space="preserve"> PAGEREF _Toc243480957 \h </w:instrText>
         </w:r>
         <w:r>
           <w:rPr>
@@ -4642,7 +4648,7 @@
             <w:noProof/>
             <w:webHidden/>
           </w:rPr>
-          <w:t>32</w:t>
+          <w:t>33</w:t>
         </w:r>
         <w:r>
           <w:rPr>
@@ -4669,7 +4675,7 @@
           <w14:ligatures w14:val="standardContextual"/>
         </w:rPr>
       </w:pPr>
-      <w:hyperlink w:anchor="_Toc243418557" w:history="1">
+      <w:hyperlink w:anchor="_Toc243480958" w:history="1">
         <w:r>
           <w:rPr>
             <w:rStyle w:val="aff9"/>
@@ -4703,7 +4709,7 @@
             <w:noProof/>
             <w:webHidden/>
           </w:rPr>
-          <w:instrText xml:space="preserve"> PAGEREF _Toc243418557 \h </w:instrText>
+          <w:instrText xml:space="preserve"> PAGEREF _Toc243480958 \h </w:instrText>
         </w:r>
         <w:r>
           <w:rPr>
@@ -4723,7 +4729,7 @@
             <w:noProof/>
             <w:webHidden/>
           </w:rPr>
-          <w:t>33</w:t>
+          <w:t>34</w:t>
         </w:r>
         <w:r>
           <w:rPr>
@@ -4751,7 +4757,7 @@
           <w14:ligatures w14:val="standardContextual"/>
         </w:rPr>
       </w:pPr>
-      <w:hyperlink w:anchor="_Toc243418558" w:history="1">
+      <w:hyperlink w:anchor="_Toc243480959" w:history="1">
         <w:r>
           <w:rPr>
             <w:rStyle w:val="aff9"/>
@@ -4785,7 +4791,7 @@
             <w:noProof/>
             <w:webHidden/>
           </w:rPr>
-          <w:instrText xml:space="preserve"> PAGEREF _Toc243418558 \h </w:instrText>
+          <w:instrText xml:space="preserve"> PAGEREF _Toc243480959 \h </w:instrText>
         </w:r>
         <w:r>
           <w:rPr>
@@ -4805,7 +4811,7 @@
             <w:noProof/>
             <w:webHidden/>
           </w:rPr>
-          <w:t>33</w:t>
+          <w:t>34</w:t>
         </w:r>
         <w:r>
           <w:rPr>
@@ -4833,7 +4839,7 @@
           <w14:ligatures w14:val="standardContextual"/>
         </w:rPr>
       </w:pPr>
-      <w:hyperlink w:anchor="_Toc243418559" w:history="1">
+      <w:hyperlink w:anchor="_Toc243480960" w:history="1">
         <w:r>
           <w:rPr>
             <w:rStyle w:val="aff9"/>
@@ -4867,7 +4873,7 @@
             <w:noProof/>
             <w:webHidden/>
           </w:rPr>
-          <w:instrText xml:space="preserve"> PAGEREF _Toc243418559 \h </w:instrText>
+          <w:instrText xml:space="preserve"> PAGEREF _Toc243480960 \h </w:instrText>
         </w:r>
         <w:r>
           <w:rPr>
@@ -4887,7 +4893,7 @@
             <w:noProof/>
             <w:webHidden/>
           </w:rPr>
-          <w:t>33</w:t>
+          <w:t>34</w:t>
         </w:r>
         <w:r>
           <w:rPr>
@@ -4915,7 +4921,7 @@
           <w14:ligatures w14:val="standardContextual"/>
         </w:rPr>
       </w:pPr>
-      <w:hyperlink w:anchor="_Toc243418560" w:history="1">
+      <w:hyperlink w:anchor="_Toc243480961" w:history="1">
         <w:r>
           <w:rPr>
             <w:rStyle w:val="aff9"/>
@@ -4949,7 +4955,7 @@
             <w:noProof/>
             <w:webHidden/>
           </w:rPr>
-          <w:instrText xml:space="preserve"> PAGEREF _Toc243418560 \h </w:instrText>
+          <w:instrText xml:space="preserve"> PAGEREF _Toc243480961 \h </w:instrText>
         </w:r>
         <w:r>
           <w:rPr>
@@ -4969,7 +4975,7 @@
             <w:noProof/>
             <w:webHidden/>
           </w:rPr>
-          <w:t>34</w:t>
+          <w:t>35</w:t>
         </w:r>
         <w:r>
           <w:rPr>
@@ -4996,7 +5002,7 @@
           <w14:ligatures w14:val="standardContextual"/>
         </w:rPr>
       </w:pPr>
-      <w:hyperlink w:anchor="_Toc243418561" w:history="1">
+      <w:hyperlink w:anchor="_Toc243480962" w:history="1">
         <w:r>
           <w:rPr>
             <w:rStyle w:val="aff9"/>
@@ -5030,7 +5036,7 @@
             <w:noProof/>
             <w:webHidden/>
           </w:rPr>
-          <w:instrText xml:space="preserve"> PAGEREF _Toc243418561 \h </w:instrText>
+          <w:instrText xml:space="preserve"> PAGEREF _Toc243480962 \h </w:instrText>
         </w:r>
         <w:r>
           <w:rPr>
@@ -5050,7 +5056,7 @@
             <w:noProof/>
             <w:webHidden/>
           </w:rPr>
-          <w:t>35</w:t>
+          <w:t>36</w:t>
         </w:r>
         <w:r>
           <w:rPr>
@@ -5075,7 +5081,7 @@
         <w:pStyle w:val="1"/>
         <w:pageBreakBefore/>
       </w:pPr>
-      <w:bookmarkStart w:id="0" w:name="_Toc243418502"/>
+      <w:bookmarkStart w:id="0" w:name="_Toc243480903"/>
       <w:r>
         <w:lastRenderedPageBreak/>
         <w:t xml:space="preserve">1 </w:t>
@@ -5089,7 +5095,7 @@
       <w:pPr>
         <w:pStyle w:val="21"/>
       </w:pPr>
-      <w:bookmarkStart w:id="1" w:name="_Toc243418503"/>
+      <w:bookmarkStart w:id="1" w:name="_Toc243480904"/>
       <w:r>
         <w:t xml:space="preserve">1.1 </w:t>
       </w:r>
@@ -5110,7 +5116,7 @@
       <w:pPr>
         <w:pStyle w:val="21"/>
       </w:pPr>
-      <w:bookmarkStart w:id="2" w:name="_Toc243418504"/>
+      <w:bookmarkStart w:id="2" w:name="_Toc243480905"/>
       <w:r>
         <w:t xml:space="preserve">1.2 </w:t>
       </w:r>
@@ -5199,7 +5205,7 @@
       <w:pPr>
         <w:pStyle w:val="21"/>
       </w:pPr>
-      <w:bookmarkStart w:id="3" w:name="_Toc243418505"/>
+      <w:bookmarkStart w:id="3" w:name="_Toc243480906"/>
       <w:r>
         <w:t xml:space="preserve">1.3 </w:t>
       </w:r>
@@ -5673,7 +5679,7 @@
       <w:pPr>
         <w:pStyle w:val="1"/>
       </w:pPr>
-      <w:bookmarkStart w:id="4" w:name="_Toc243418506"/>
+      <w:bookmarkStart w:id="4" w:name="_Toc243480907"/>
       <w:r>
         <w:lastRenderedPageBreak/>
         <w:t xml:space="preserve">2 </w:t>
@@ -5687,7 +5693,7 @@
       <w:pPr>
         <w:pStyle w:val="21"/>
       </w:pPr>
-      <w:bookmarkStart w:id="5" w:name="_Toc243418507"/>
+      <w:bookmarkStart w:id="5" w:name="_Toc243480908"/>
       <w:r>
         <w:t xml:space="preserve">2.1 </w:t>
       </w:r>
@@ -6782,7 +6788,7 @@
       <w:pPr>
         <w:pStyle w:val="21"/>
       </w:pPr>
-      <w:bookmarkStart w:id="6" w:name="_Toc243418508"/>
+      <w:bookmarkStart w:id="6" w:name="_Toc243480909"/>
       <w:r>
         <w:lastRenderedPageBreak/>
         <w:t xml:space="preserve">2.2 </w:t>
@@ -8588,25 +8594,43 @@
               <w:t xml:space="preserve">PostgreSQL </w:t>
             </w:r>
             <w:r>
-              <w:t>保存结构化业务与必要任务记录；</w:t>
-            </w:r>
-            <w:r>
-              <w:t xml:space="preserve">SeaweedFS </w:t>
-            </w:r>
-            <w:r>
-              <w:t>通过</w:t>
-            </w:r>
-            <w:r>
-              <w:t xml:space="preserve"> S3 </w:t>
-            </w:r>
-            <w:r>
-              <w:t>接口管理私有文件；不引入</w:t>
-            </w:r>
-            <w:r>
-              <w:t xml:space="preserve"> Redis</w:t>
-            </w:r>
-            <w:r>
-              <w:t>、独立消息队列和监控中间件</w:t>
+              <w:t>保存业务、任务与</w:t>
+            </w:r>
+            <w:r>
+              <w:t xml:space="preserve"> Outbox</w:t>
+            </w:r>
+            <w:r>
+              <w:t>；</w:t>
+            </w:r>
+            <w:r>
+              <w:t xml:space="preserve">Redis </w:t>
+            </w:r>
+            <w:r>
+              <w:t>保存可过期状态；</w:t>
+            </w:r>
+            <w:r>
+              <w:t xml:space="preserve">Elasticsearch </w:t>
+            </w:r>
+            <w:r>
+              <w:t>保存派生索引；</w:t>
+            </w:r>
+            <w:r>
+              <w:t xml:space="preserve">RabbitMQ </w:t>
+            </w:r>
+            <w:r>
+              <w:t>投递后台任务；</w:t>
+            </w:r>
+            <w:r>
+              <w:t xml:space="preserve">S3 </w:t>
+            </w:r>
+            <w:r>
+              <w:t>保存私有文件；</w:t>
+            </w:r>
+            <w:r>
+              <w:t xml:space="preserve">Nginx </w:t>
+            </w:r>
+            <w:r>
+              <w:t>提供统一入口，不部署监控中间件</w:t>
             </w:r>
           </w:p>
         </w:tc>
@@ -8696,25 +8720,40 @@
               <w:pStyle w:val="TableBody"/>
             </w:pPr>
             <w:r>
-              <w:t>主服务使用有界执行器协调，</w:t>
-            </w:r>
-            <w:r>
-              <w:t xml:space="preserve">PDF </w:t>
-            </w:r>
-            <w:r>
-              <w:t>在独立</w:t>
+              <w:t xml:space="preserve">11 </w:t>
+            </w:r>
+            <w:r>
+              <w:t>个核心</w:t>
+            </w:r>
+            <w:r>
+              <w:t xml:space="preserve"> PDF </w:t>
+            </w:r>
+            <w:r>
+              <w:t>接口保持同步；有界协调器启动独立</w:t>
             </w:r>
             <w:r>
               <w:t xml:space="preserve"> Java </w:t>
             </w:r>
             <w:r>
-              <w:t>子进程执行；初始同时执行</w:t>
-            </w:r>
-            <w:r>
-              <w:t xml:space="preserve"> 2 </w:t>
-            </w:r>
-            <w:r>
-              <w:t>项；超时终止子进程；敏感凭据任务中断后重新输入</w:t>
+              <w:t>子进程，初始并发</w:t>
+            </w:r>
+            <w:r>
+              <w:t xml:space="preserve"> 2</w:t>
+            </w:r>
+            <w:r>
+              <w:t>、期限</w:t>
+            </w:r>
+            <w:r>
+              <w:t xml:space="preserve"> 120 </w:t>
+            </w:r>
+            <w:r>
+              <w:t>秒；索引和清理由独立</w:t>
+            </w:r>
+            <w:r>
+              <w:t xml:space="preserve"> Worker </w:t>
+            </w:r>
+            <w:r>
+              <w:t>执行；敏感凭据操作中断后重新输入，不自动重放</w:t>
             </w:r>
           </w:p>
         </w:tc>
@@ -8753,7 +8792,7 @@
         <w:pStyle w:val="1"/>
         <w:pageBreakBefore/>
       </w:pPr>
-      <w:bookmarkStart w:id="7" w:name="_Toc243418509"/>
+      <w:bookmarkStart w:id="7" w:name="_Toc243480910"/>
       <w:r>
         <w:lastRenderedPageBreak/>
         <w:t xml:space="preserve">3 </w:t>
@@ -8784,7 +8823,7 @@
       <w:pPr>
         <w:pStyle w:val="21"/>
       </w:pPr>
-      <w:bookmarkStart w:id="8" w:name="_Toc243418510"/>
+      <w:bookmarkStart w:id="8" w:name="_Toc243480911"/>
       <w:r>
         <w:t xml:space="preserve">3.1 FR1 PDF </w:t>
       </w:r>
@@ -8903,7 +8942,7 @@
       <w:pPr>
         <w:pStyle w:val="21"/>
       </w:pPr>
-      <w:bookmarkStart w:id="9" w:name="_Toc243418511"/>
+      <w:bookmarkStart w:id="9" w:name="_Toc243480912"/>
       <w:r>
         <w:t xml:space="preserve">3.2 FR2 </w:t>
       </w:r>
@@ -9016,7 +9055,7 @@
       <w:pPr>
         <w:pStyle w:val="21"/>
       </w:pPr>
-      <w:bookmarkStart w:id="10" w:name="_Toc243418512"/>
+      <w:bookmarkStart w:id="10" w:name="_Toc243480913"/>
       <w:r>
         <w:t xml:space="preserve">3.3 FR3 </w:t>
       </w:r>
@@ -9133,7 +9172,7 @@
       <w:pPr>
         <w:pStyle w:val="21"/>
       </w:pPr>
-      <w:bookmarkStart w:id="11" w:name="_Toc243418513"/>
+      <w:bookmarkStart w:id="11" w:name="_Toc243480914"/>
       <w:r>
         <w:t xml:space="preserve">3.4 FR4 </w:t>
       </w:r>
@@ -9252,7 +9291,7 @@
       <w:pPr>
         <w:pStyle w:val="21"/>
       </w:pPr>
-      <w:bookmarkStart w:id="12" w:name="_Toc243418514"/>
+      <w:bookmarkStart w:id="12" w:name="_Toc243480915"/>
       <w:r>
         <w:t xml:space="preserve">3.5 FR5 </w:t>
       </w:r>
@@ -9344,7 +9383,7 @@
       <w:pPr>
         <w:pStyle w:val="21"/>
       </w:pPr>
-      <w:bookmarkStart w:id="13" w:name="_Toc243418515"/>
+      <w:bookmarkStart w:id="13" w:name="_Toc243480916"/>
       <w:r>
         <w:t xml:space="preserve">3.6 FR6 </w:t>
       </w:r>
@@ -9449,7 +9488,7 @@
       <w:pPr>
         <w:pStyle w:val="21"/>
       </w:pPr>
-      <w:bookmarkStart w:id="14" w:name="_Toc243418516"/>
+      <w:bookmarkStart w:id="14" w:name="_Toc243480917"/>
       <w:r>
         <w:t xml:space="preserve">3.7 FR7 </w:t>
       </w:r>
@@ -9589,7 +9628,7 @@
       <w:pPr>
         <w:pStyle w:val="21"/>
       </w:pPr>
-      <w:bookmarkStart w:id="15" w:name="_Toc243418517"/>
+      <w:bookmarkStart w:id="15" w:name="_Toc243480918"/>
       <w:r>
         <w:t xml:space="preserve">3.8 FR8 </w:t>
       </w:r>
@@ -9607,7 +9646,7 @@
       <w:pPr>
         <w:pStyle w:val="21"/>
       </w:pPr>
-      <w:bookmarkStart w:id="16" w:name="_Toc243418518"/>
+      <w:bookmarkStart w:id="16" w:name="_Toc243480919"/>
       <w:r>
         <w:t xml:space="preserve">3.9 FR9 </w:t>
       </w:r>
@@ -9711,7 +9750,7 @@
       <w:pPr>
         <w:pStyle w:val="21"/>
       </w:pPr>
-      <w:bookmarkStart w:id="17" w:name="_Toc243418519"/>
+      <w:bookmarkStart w:id="17" w:name="_Toc243480920"/>
       <w:r>
         <w:lastRenderedPageBreak/>
         <w:t xml:space="preserve">3.10 FR10 </w:t>
@@ -9807,7 +9846,7 @@
       <w:pPr>
         <w:pStyle w:val="21"/>
       </w:pPr>
-      <w:bookmarkStart w:id="18" w:name="_Toc243418520"/>
+      <w:bookmarkStart w:id="18" w:name="_Toc243480921"/>
       <w:r>
         <w:t xml:space="preserve">3.11 FR11 </w:t>
       </w:r>
@@ -9959,7 +9998,7 @@
       <w:pPr>
         <w:pStyle w:val="21"/>
       </w:pPr>
-      <w:bookmarkStart w:id="19" w:name="_Toc243418521"/>
+      <w:bookmarkStart w:id="19" w:name="_Toc243480922"/>
       <w:r>
         <w:t xml:space="preserve">3.12 FR12 </w:t>
       </w:r>
@@ -10114,7 +10153,7 @@
       <w:pPr>
         <w:pStyle w:val="21"/>
       </w:pPr>
-      <w:bookmarkStart w:id="20" w:name="_Toc243418522"/>
+      <w:bookmarkStart w:id="20" w:name="_Toc243480923"/>
       <w:r>
         <w:lastRenderedPageBreak/>
         <w:t xml:space="preserve">3.13 FR13 </w:t>
@@ -10231,7 +10270,7 @@
       <w:pPr>
         <w:pStyle w:val="21"/>
       </w:pPr>
-      <w:bookmarkStart w:id="21" w:name="_Toc243418523"/>
+      <w:bookmarkStart w:id="21" w:name="_Toc243480924"/>
       <w:r>
         <w:t xml:space="preserve">3.14 FR14 </w:t>
       </w:r>
@@ -10323,7 +10362,7 @@
       <w:pPr>
         <w:pStyle w:val="21"/>
       </w:pPr>
-      <w:bookmarkStart w:id="22" w:name="_Toc243418524"/>
+      <w:bookmarkStart w:id="22" w:name="_Toc243480925"/>
       <w:r>
         <w:t xml:space="preserve">3.15 FR15 </w:t>
       </w:r>
@@ -10442,7 +10481,7 @@
       <w:pPr>
         <w:pStyle w:val="21"/>
       </w:pPr>
-      <w:bookmarkStart w:id="23" w:name="_Toc243418525"/>
+      <w:bookmarkStart w:id="23" w:name="_Toc243480926"/>
       <w:r>
         <w:lastRenderedPageBreak/>
         <w:t xml:space="preserve">3.16 FR16 AES </w:t>
@@ -10604,7 +10643,7 @@
       <w:pPr>
         <w:pStyle w:val="21"/>
       </w:pPr>
-      <w:bookmarkStart w:id="24" w:name="_Toc243418526"/>
+      <w:bookmarkStart w:id="24" w:name="_Toc243480927"/>
       <w:r>
         <w:t xml:space="preserve">3.17 FR17 </w:t>
       </w:r>
@@ -10747,7 +10786,7 @@
       <w:pPr>
         <w:pStyle w:val="21"/>
       </w:pPr>
-      <w:bookmarkStart w:id="25" w:name="_Toc243418527"/>
+      <w:bookmarkStart w:id="25" w:name="_Toc243480928"/>
       <w:r>
         <w:t xml:space="preserve">3.18 FR18 </w:t>
       </w:r>
@@ -10848,7 +10887,7 @@
       <w:pPr>
         <w:pStyle w:val="21"/>
       </w:pPr>
-      <w:bookmarkStart w:id="26" w:name="_Toc243418528"/>
+      <w:bookmarkStart w:id="26" w:name="_Toc243480929"/>
       <w:r>
         <w:lastRenderedPageBreak/>
         <w:t xml:space="preserve">3.19 FR19 </w:t>
@@ -10965,7 +11004,7 @@
       <w:pPr>
         <w:pStyle w:val="21"/>
       </w:pPr>
-      <w:bookmarkStart w:id="27" w:name="_Toc243418529"/>
+      <w:bookmarkStart w:id="27" w:name="_Toc243480930"/>
       <w:r>
         <w:t xml:space="preserve">3.20 WM01 </w:t>
       </w:r>
@@ -11108,7 +11147,7 @@
       <w:pPr>
         <w:pStyle w:val="21"/>
       </w:pPr>
-      <w:bookmarkStart w:id="28" w:name="_Toc243418530"/>
+      <w:bookmarkStart w:id="28" w:name="_Toc243480931"/>
       <w:r>
         <w:t xml:space="preserve">3.21 WM02 </w:t>
       </w:r>
@@ -11246,7 +11285,7 @@
       <w:pPr>
         <w:pStyle w:val="21"/>
       </w:pPr>
-      <w:bookmarkStart w:id="29" w:name="_Toc243418531"/>
+      <w:bookmarkStart w:id="29" w:name="_Toc243480932"/>
       <w:r>
         <w:t xml:space="preserve">3.22 PAGE01 </w:t>
       </w:r>
@@ -11386,7 +11425,7 @@
       <w:pPr>
         <w:pStyle w:val="21"/>
       </w:pPr>
-      <w:bookmarkStart w:id="30" w:name="_Toc243418532"/>
+      <w:bookmarkStart w:id="30" w:name="_Toc243480933"/>
       <w:r>
         <w:t xml:space="preserve">3.23 ERR01 </w:t>
       </w:r>
@@ -11497,7 +11536,7 @@
         <w:pStyle w:val="1"/>
         <w:pageBreakBefore/>
       </w:pPr>
-      <w:bookmarkStart w:id="31" w:name="_Toc243418533"/>
+      <w:bookmarkStart w:id="31" w:name="_Toc243480934"/>
       <w:r>
         <w:lastRenderedPageBreak/>
         <w:t xml:space="preserve">4 </w:t>
@@ -11511,7 +11550,7 @@
       <w:pPr>
         <w:pStyle w:val="21"/>
       </w:pPr>
-      <w:bookmarkStart w:id="32" w:name="_Toc243418534"/>
+      <w:bookmarkStart w:id="32" w:name="_Toc243480935"/>
       <w:r>
         <w:t xml:space="preserve">4.1 </w:t>
       </w:r>
@@ -11689,7 +11728,7 @@
     </w:p>
     <w:p>
       <w:r>
-        <w:t>空白、零页、损坏、特殊布局、缺失元数据及不支持特性均形成有限结果或明确错误；任务有状态，子进程异常不结束接口进程。</w:t>
+        <w:t>空白、零页、损坏、特殊布局、缺失元数据及不支持特性均形成有限结果或明确错误；子进程异常不结束接口进程；可恢复后台任务按持久状态接管，重复投递不得重复提交。</w:t>
       </w:r>
     </w:p>
     <w:p>
@@ -11706,19 +11745,43 @@
         <w:t xml:space="preserve"> </w:t>
       </w:r>
       <w:r>
-        <w:t>异常后仍能处理下一份正常</w:t>
+        <w:t>异常后仍能处理正常</w:t>
       </w:r>
       <w:r>
         <w:t xml:space="preserve"> PDF</w:t>
       </w:r>
       <w:r>
-        <w:t>；模拟子进程退出和</w:t>
-      </w:r>
-      <w:r>
-        <w:t xml:space="preserve"> 120 </w:t>
-      </w:r>
-      <w:r>
-        <w:t>秒期限，验证终态、清理及名额释放；服务重启将中断操作标识为中断。</w:t>
+        <w:t>；模拟子进程退出、</w:t>
+      </w:r>
+      <w:r>
+        <w:t xml:space="preserve">120 </w:t>
+      </w:r>
+      <w:r>
+        <w:t>秒超时及</w:t>
+      </w:r>
+      <w:r>
+        <w:t xml:space="preserve"> Worker </w:t>
+      </w:r>
+      <w:r>
+        <w:t>崩溃，检查名额释放、租约接管与清理；敏感凭据操作中断后重新输入；</w:t>
+      </w:r>
+      <w:r>
+        <w:t>Redis</w:t>
+      </w:r>
+      <w:r>
+        <w:t>、检索或</w:t>
+      </w:r>
+      <w:r>
+        <w:t xml:space="preserve"> AMQP </w:t>
+      </w:r>
+      <w:r>
+        <w:t>故障不阻断不依赖它们的同步</w:t>
+      </w:r>
+      <w:r>
+        <w:t xml:space="preserve"> PDF </w:t>
+      </w:r>
+      <w:r>
+        <w:t>接口。</w:t>
       </w:r>
     </w:p>
     <w:p>
@@ -11765,6 +11828,7 @@
         <w:pStyle w:val="31"/>
       </w:pPr>
       <w:r>
+        <w:lastRenderedPageBreak/>
         <w:t xml:space="preserve">NFR5 </w:t>
       </w:r>
       <w:r>
@@ -11793,7 +11857,6 @@
         <w:rPr>
           <w:b/>
         </w:rPr>
-        <w:lastRenderedPageBreak/>
         <w:t>验收安排</w:t>
       </w:r>
       <w:r>
@@ -11897,7 +11960,7 @@
       <w:pPr>
         <w:pStyle w:val="21"/>
       </w:pPr>
-      <w:bookmarkStart w:id="33" w:name="_Toc243418535"/>
+      <w:bookmarkStart w:id="33" w:name="_Toc243480936"/>
       <w:r>
         <w:t xml:space="preserve">4.2 </w:t>
       </w:r>
@@ -12671,6 +12734,7 @@
               <w:rPr>
                 <w:sz w:val="19"/>
               </w:rPr>
+              <w:lastRenderedPageBreak/>
               <w:t>PDF_PERMISSION_DENIED</w:t>
             </w:r>
           </w:p>
@@ -12851,7 +12915,6 @@
               <w:rPr>
                 <w:sz w:val="19"/>
               </w:rPr>
-              <w:lastRenderedPageBreak/>
               <w:t>FILE_TOO_LARGE / PAGE_LIMIT / OUTPUT_LIMIT</w:t>
             </w:r>
           </w:p>
@@ -13756,7 +13819,7 @@
       <w:pPr>
         <w:pStyle w:val="21"/>
       </w:pPr>
-      <w:bookmarkStart w:id="34" w:name="_Toc243418536"/>
+      <w:bookmarkStart w:id="34" w:name="_Toc243480937"/>
       <w:r>
         <w:t xml:space="preserve">4.3 </w:t>
       </w:r>
@@ -13772,6 +13835,7 @@
     </w:p>
     <w:p>
       <w:r>
+        <w:lastRenderedPageBreak/>
         <w:t>普通工具输入与结果的保存期限默认</w:t>
       </w:r>
       <w:r>
@@ -13785,9 +13849,8 @@
       <w:pPr>
         <w:pStyle w:val="1"/>
       </w:pPr>
-      <w:bookmarkStart w:id="35" w:name="_Toc243418537"/>
-      <w:r>
-        <w:lastRenderedPageBreak/>
+      <w:bookmarkStart w:id="35" w:name="_Toc243480938"/>
+      <w:r>
         <w:t xml:space="preserve">5 </w:t>
       </w:r>
       <w:r>
@@ -13799,7 +13862,7 @@
       <w:pPr>
         <w:pStyle w:val="21"/>
       </w:pPr>
-      <w:bookmarkStart w:id="36" w:name="_Toc243418538"/>
+      <w:bookmarkStart w:id="36" w:name="_Toc243480939"/>
       <w:r>
         <w:t xml:space="preserve">5.1 </w:t>
       </w:r>
@@ -13810,25 +13873,31 @@
     </w:p>
     <w:p>
       <w:r>
-        <w:t>采用模块化单体。主服务与</w:t>
+        <w:t>采用同一代码库内的模块化架构，区分</w:t>
+      </w:r>
+      <w:r>
+        <w:t xml:space="preserve"> Web</w:t>
+      </w:r>
+      <w:r>
+        <w:t>、后台</w:t>
+      </w:r>
+      <w:r>
+        <w:t xml:space="preserve"> Worker </w:t>
+      </w:r>
+      <w:r>
+        <w:t>与受限</w:t>
       </w:r>
       <w:r>
         <w:t xml:space="preserve"> PDF </w:t>
       </w:r>
       <w:r>
-        <w:t>执行入口属于同一代码库，分别承担</w:t>
-      </w:r>
-      <w:r>
-        <w:t xml:space="preserve"> HTTP </w:t>
-      </w:r>
-      <w:r>
-        <w:t>协调与文档处理；不拆分微服务。</w:t>
+        <w:t>执行进程。</w:t>
       </w:r>
       <w:r>
         <w:t xml:space="preserve">Windows </w:t>
       </w:r>
       <w:r>
-        <w:t>直接运行</w:t>
+        <w:t>原生运行</w:t>
       </w:r>
       <w:r>
         <w:t xml:space="preserve"> Java</w:t>
@@ -13840,19 +13909,25 @@
         <w:t xml:space="preserve">Node.js </w:t>
       </w:r>
       <w:r>
-        <w:t>负责开发和构建；</w:t>
-      </w:r>
-      <w:r>
-        <w:t xml:space="preserve">Docker </w:t>
-      </w:r>
-      <w:r>
-        <w:t>仅提供</w:t>
-      </w:r>
-      <w:r>
-        <w:t xml:space="preserve"> PostgreSQL </w:t>
-      </w:r>
-      <w:r>
-        <w:t>与私有对象存储。</w:t>
+        <w:t>负责前端开发和构建；</w:t>
+      </w:r>
+      <w:r>
+        <w:t xml:space="preserve">Nginx </w:t>
+      </w:r>
+      <w:r>
+        <w:t>提供正式静态页面并代理</w:t>
+      </w:r>
+      <w:r>
+        <w:t xml:space="preserve"> API</w:t>
+      </w:r>
+      <w:r>
+        <w:t>。数据库、可过期状态、派生索引、消息投递与私有文件服务由</w:t>
+      </w:r>
+      <w:r>
+        <w:t xml:space="preserve"> Docker </w:t>
+      </w:r>
+      <w:r>
+        <w:t>承载，不拆分独立业务微服务。</w:t>
       </w:r>
     </w:p>
     <w:p>
@@ -14146,13 +14221,13 @@
               <w:pStyle w:val="TableBody"/>
             </w:pPr>
             <w:r>
-              <w:t>开发使用热更新服务；正式构建生成静态文件，由</w:t>
-            </w:r>
-            <w:r>
-              <w:t xml:space="preserve"> Spring Boot </w:t>
-            </w:r>
-            <w:r>
-              <w:t>同源提供，运行页面不依赖</w:t>
+              <w:t>开发使用热更新服务，正式构建生成静态文件；运行页面不依赖</w:t>
+            </w:r>
+            <w:r>
+              <w:t xml:space="preserve"> Vite </w:t>
+            </w:r>
+            <w:r>
+              <w:t>开发服务器或</w:t>
             </w:r>
             <w:r>
               <w:t xml:space="preserve"> Node.js </w:t>
@@ -14185,7 +14260,7 @@
               <w:jc w:val="center"/>
             </w:pPr>
             <w:r>
-              <w:t>应用协调</w:t>
+              <w:t>同源入口</w:t>
             </w:r>
           </w:p>
         </w:tc>
@@ -14205,13 +14280,7 @@
               <w:pStyle w:val="TableBody"/>
             </w:pPr>
             <w:r>
-              <w:t xml:space="preserve">Java 21 </w:t>
-            </w:r>
-            <w:r>
-              <w:t>编译目标、</w:t>
-            </w:r>
-            <w:r>
-              <w:t>Spring Boot</w:t>
+              <w:t>Nginx</w:t>
             </w:r>
           </w:p>
         </w:tc>
@@ -14231,7 +14300,13 @@
               <w:pStyle w:val="TableBody"/>
             </w:pPr>
             <w:r>
-              <w:t>统一校验、处理空间、任务状态、结果返回和有界执行；本机直接运行，不要求应用容器化。</w:t>
+              <w:t>提供静态资源并反向代理</w:t>
+            </w:r>
+            <w:r>
+              <w:t xml:space="preserve"> API</w:t>
+            </w:r>
+            <w:r>
+              <w:t>；控制请求体、允许域名与缓存；上传和流式响应分别配置缓冲。</w:t>
             </w:r>
           </w:p>
         </w:tc>
@@ -14258,10 +14333,7 @@
               <w:jc w:val="center"/>
             </w:pPr>
             <w:r>
-              <w:t xml:space="preserve">PDF </w:t>
-            </w:r>
-            <w:r>
-              <w:t>执行</w:t>
+              <w:t>应用协调</w:t>
             </w:r>
           </w:p>
         </w:tc>
@@ -14281,19 +14353,13 @@
               <w:pStyle w:val="TableBody"/>
             </w:pPr>
             <w:r>
-              <w:t>PDFBox</w:t>
-            </w:r>
-            <w:r>
-              <w:t>、</w:t>
-            </w:r>
-            <w:r>
-              <w:t>Bouncy Castle</w:t>
-            </w:r>
-            <w:r>
-              <w:t>、</w:t>
-            </w:r>
-            <w:r>
-              <w:t>RE2/J</w:t>
+              <w:t xml:space="preserve">Java 21 </w:t>
+            </w:r>
+            <w:r>
+              <w:t>编译目标、</w:t>
+            </w:r>
+            <w:r>
+              <w:t>Spring Boot</w:t>
             </w:r>
           </w:p>
         </w:tc>
@@ -14313,19 +14379,22 @@
               <w:pStyle w:val="TableBody"/>
             </w:pPr>
             <w:r>
-              <w:t>复用独立</w:t>
-            </w:r>
-            <w:r>
-              <w:t xml:space="preserve"> Java </w:t>
-            </w:r>
-            <w:r>
-              <w:t>工具；通过独立处理入口执行</w:t>
-            </w:r>
-            <w:r>
-              <w:t xml:space="preserve"> PDF </w:t>
-            </w:r>
-            <w:r>
-              <w:t>操作，主服务用有界执行器协调，进程与线程职责不同。</w:t>
+              <w:t xml:space="preserve">Windows </w:t>
+            </w:r>
+            <w:r>
+              <w:t>原生</w:t>
+            </w:r>
+            <w:r>
+              <w:t xml:space="preserve"> Web </w:t>
+            </w:r>
+            <w:r>
+              <w:t>负责校验、同步协调和结果返回；独立非</w:t>
+            </w:r>
+            <w:r>
+              <w:t xml:space="preserve"> Web Worker </w:t>
+            </w:r>
+            <w:r>
+              <w:t>负责后台投递、执行与恢复；保持同一代码库。</w:t>
             </w:r>
           </w:p>
         </w:tc>
@@ -14352,7 +14421,10 @@
               <w:jc w:val="center"/>
             </w:pPr>
             <w:r>
-              <w:t>业务持久化</w:t>
+              <w:t xml:space="preserve">PDF </w:t>
+            </w:r>
+            <w:r>
+              <w:t>执行</w:t>
             </w:r>
           </w:p>
         </w:tc>
@@ -14372,19 +14444,19 @@
               <w:pStyle w:val="TableBody"/>
             </w:pPr>
             <w:r>
-              <w:t>PostgreSQL</w:t>
+              <w:t>PDFBox</w:t>
             </w:r>
             <w:r>
               <w:t>、</w:t>
             </w:r>
             <w:r>
-              <w:t>Spring JDBC</w:t>
+              <w:t>Bouncy Castle</w:t>
             </w:r>
             <w:r>
               <w:t>、</w:t>
             </w:r>
             <w:r>
-              <w:t>Flyway</w:t>
+              <w:t>RE2/J</w:t>
             </w:r>
           </w:p>
         </w:tc>
@@ -14404,7 +14476,19 @@
               <w:pStyle w:val="TableBody"/>
             </w:pPr>
             <w:r>
-              <w:t>结构化数据、会话和必要任务状态统一持久化，版本化迁移；不将内存状态作为后台任务唯一来源。</w:t>
+              <w:t>复用独立</w:t>
+            </w:r>
+            <w:r>
+              <w:t xml:space="preserve"> Java </w:t>
+            </w:r>
+            <w:r>
+              <w:t>工具；通过独立处理入口执行</w:t>
+            </w:r>
+            <w:r>
+              <w:t xml:space="preserve"> PDF </w:t>
+            </w:r>
+            <w:r>
+              <w:t>操作，主服务用有界执行器协调，进程与线程职责不同。</w:t>
             </w:r>
           </w:p>
         </w:tc>
@@ -14431,7 +14515,7 @@
               <w:jc w:val="center"/>
             </w:pPr>
             <w:r>
-              <w:t>私有文件</w:t>
+              <w:t>业务持久化</w:t>
             </w:r>
           </w:p>
         </w:tc>
@@ -14451,16 +14535,19 @@
               <w:pStyle w:val="TableBody"/>
             </w:pPr>
             <w:r>
-              <w:t xml:space="preserve">SeaweedFS </w:t>
-            </w:r>
-            <w:r>
-              <w:t>的</w:t>
-            </w:r>
-            <w:r>
-              <w:t xml:space="preserve"> S3 </w:t>
-            </w:r>
-            <w:r>
-              <w:t>接口</w:t>
+              <w:t>PostgreSQL</w:t>
+            </w:r>
+            <w:r>
+              <w:t>、</w:t>
+            </w:r>
+            <w:r>
+              <w:t>Spring JDBC</w:t>
+            </w:r>
+            <w:r>
+              <w:t>、</w:t>
+            </w:r>
+            <w:r>
+              <w:t>Flyway</w:t>
             </w:r>
           </w:p>
         </w:tc>
@@ -14480,13 +14567,13 @@
               <w:pStyle w:val="TableBody"/>
             </w:pPr>
             <w:r>
-              <w:t>保存原始</w:t>
-            </w:r>
-            <w:r>
-              <w:t xml:space="preserve"> PDF </w:t>
-            </w:r>
-            <w:r>
-              <w:t>与处理副本，使用内部对象标识、校验和和生命周期；数据库保存关系和元信息。</w:t>
+              <w:t>保存归属、对象关系、持久任务、执行租约和事务</w:t>
+            </w:r>
+            <w:r>
+              <w:t xml:space="preserve"> Outbox</w:t>
+            </w:r>
+            <w:r>
+              <w:t>；迁移按版本执行，任务结果以数据库条件提交。</w:t>
             </w:r>
           </w:p>
         </w:tc>
@@ -14513,7 +14600,7 @@
               <w:jc w:val="center"/>
             </w:pPr>
             <w:r>
-              <w:t>中间件部署</w:t>
+              <w:t>可过期状态</w:t>
             </w:r>
           </w:p>
         </w:tc>
@@ -14533,7 +14620,13 @@
               <w:pStyle w:val="TableBody"/>
             </w:pPr>
             <w:r>
-              <w:t>Docker</w:t>
+              <w:t>Redis</w:t>
+            </w:r>
+            <w:r>
+              <w:t>、</w:t>
+            </w:r>
+            <w:r>
+              <w:t>Spring Session</w:t>
             </w:r>
           </w:p>
         </w:tc>
@@ -14553,13 +14646,19 @@
               <w:pStyle w:val="TableBody"/>
             </w:pPr>
             <w:r>
-              <w:t>本机只部署</w:t>
-            </w:r>
-            <w:r>
-              <w:t xml:space="preserve"> PostgreSQL </w:t>
-            </w:r>
-            <w:r>
-              <w:t>与对象存储；仅向本机应用开放必要端口，数据使用独立持久卷。</w:t>
+              <w:t>保存共享会话、限流计数与临时配额，使用命名空间、</w:t>
+            </w:r>
+            <w:r>
+              <w:t>TTL</w:t>
+            </w:r>
+            <w:r>
+              <w:t>、</w:t>
+            </w:r>
+            <w:r>
+              <w:t xml:space="preserve">ACL </w:t>
+            </w:r>
+            <w:r>
+              <w:t>和持久化；不承担业务记录或任务执行权的主存储。</w:t>
             </w:r>
           </w:p>
         </w:tc>
@@ -14586,7 +14685,8 @@
               <w:jc w:val="center"/>
             </w:pPr>
             <w:r>
-              <w:t>检索与缓存边界</w:t>
+              <w:lastRenderedPageBreak/>
+              <w:t>派生索引</w:t>
             </w:r>
           </w:p>
         </w:tc>
@@ -14606,7 +14706,7 @@
               <w:pStyle w:val="TableBody"/>
             </w:pPr>
             <w:r>
-              <w:t>无独立缓存或消息代理</w:t>
+              <w:t>Elasticsearch</w:t>
             </w:r>
           </w:p>
         </w:tc>
@@ -14626,25 +14726,259 @@
               <w:pStyle w:val="TableBody"/>
             </w:pPr>
             <w:r>
-              <w:t>当前调度以数据库记录和有界执行为主，不引入</w:t>
-            </w:r>
-            <w:r>
-              <w:t xml:space="preserve"> Redis</w:t>
+              <w:t>共享版本化别名保存文本块和来源范围；构建完成后发布就绪代次；正则搜索仍在原页文本上执行，不经过全文索引。</w:t>
+            </w:r>
+          </w:p>
+        </w:tc>
+      </w:tr>
+      <w:tr>
+        <w:trPr>
+          <w:cantSplit/>
+          <w:jc w:val="center"/>
+        </w:trPr>
+        <w:tc>
+          <w:tcPr>
+            <w:tcW w:w="1417" w:type="dxa"/>
+            <w:tcMar>
+              <w:top w:w="75" w:type="dxa"/>
+              <w:left w:w="85" w:type="dxa"/>
+              <w:bottom w:w="75" w:type="dxa"/>
+              <w:right w:w="85" w:type="dxa"/>
+            </w:tcMar>
+            <w:vAlign w:val="center"/>
+          </w:tcPr>
+          <w:p>
+            <w:pPr>
+              <w:pStyle w:val="TableBody"/>
+              <w:jc w:val="center"/>
+            </w:pPr>
+            <w:r>
+              <w:t>异步投递</w:t>
+            </w:r>
+          </w:p>
+        </w:tc>
+        <w:tc>
+          <w:tcPr>
+            <w:tcW w:w="2438" w:type="dxa"/>
+            <w:tcMar>
+              <w:top w:w="75" w:type="dxa"/>
+              <w:left w:w="85" w:type="dxa"/>
+              <w:bottom w:w="75" w:type="dxa"/>
+              <w:right w:w="85" w:type="dxa"/>
+            </w:tcMar>
+            <w:vAlign w:val="center"/>
+          </w:tcPr>
+          <w:p>
+            <w:pPr>
+              <w:pStyle w:val="TableBody"/>
+            </w:pPr>
+            <w:r>
+              <w:t>RabbitMQ</w:t>
             </w:r>
             <w:r>
               <w:t>、</w:t>
             </w:r>
             <w:r>
-              <w:t>RabbitMQ</w:t>
+              <w:t>Spring AMQP</w:t>
+            </w:r>
+          </w:p>
+        </w:tc>
+        <w:tc>
+          <w:tcPr>
+            <w:tcW w:w="4932" w:type="dxa"/>
+            <w:tcMar>
+              <w:top w:w="75" w:type="dxa"/>
+              <w:left w:w="85" w:type="dxa"/>
+              <w:bottom w:w="75" w:type="dxa"/>
+              <w:right w:w="85" w:type="dxa"/>
+            </w:tcMar>
+            <w:vAlign w:val="center"/>
+          </w:tcPr>
+          <w:p>
+            <w:pPr>
+              <w:pStyle w:val="TableBody"/>
+            </w:pPr>
+            <w:r>
+              <w:t>索引和清理使用独立的持久队列、容量及并发；</w:t>
+            </w:r>
+            <w:r>
+              <w:t xml:space="preserve">Worker </w:t>
+            </w:r>
+            <w:r>
+              <w:t>发布</w:t>
+            </w:r>
+            <w:r>
+              <w:t xml:space="preserve"> Outbox</w:t>
+            </w:r>
+            <w:r>
+              <w:t>，确认投递，提交结果后手动确认消费。</w:t>
+            </w:r>
+          </w:p>
+        </w:tc>
+      </w:tr>
+      <w:tr>
+        <w:trPr>
+          <w:cantSplit/>
+          <w:jc w:val="center"/>
+        </w:trPr>
+        <w:tc>
+          <w:tcPr>
+            <w:tcW w:w="1417" w:type="dxa"/>
+            <w:tcMar>
+              <w:top w:w="75" w:type="dxa"/>
+              <w:left w:w="85" w:type="dxa"/>
+              <w:bottom w:w="75" w:type="dxa"/>
+              <w:right w:w="85" w:type="dxa"/>
+            </w:tcMar>
+            <w:vAlign w:val="center"/>
+          </w:tcPr>
+          <w:p>
+            <w:pPr>
+              <w:pStyle w:val="TableBody"/>
+              <w:jc w:val="center"/>
+            </w:pPr>
+            <w:r>
+              <w:t>私有文件</w:t>
+            </w:r>
+          </w:p>
+        </w:tc>
+        <w:tc>
+          <w:tcPr>
+            <w:tcW w:w="2438" w:type="dxa"/>
+            <w:tcMar>
+              <w:top w:w="75" w:type="dxa"/>
+              <w:left w:w="85" w:type="dxa"/>
+              <w:bottom w:w="75" w:type="dxa"/>
+              <w:right w:w="85" w:type="dxa"/>
+            </w:tcMar>
+            <w:vAlign w:val="center"/>
+          </w:tcPr>
+          <w:p>
+            <w:pPr>
+              <w:pStyle w:val="TableBody"/>
+            </w:pPr>
+            <w:r>
+              <w:t xml:space="preserve">SeaweedFS </w:t>
+            </w:r>
+            <w:r>
+              <w:t>的</w:t>
+            </w:r>
+            <w:r>
+              <w:t xml:space="preserve"> S3 </w:t>
+            </w:r>
+            <w:r>
+              <w:t>接口</w:t>
+            </w:r>
+          </w:p>
+        </w:tc>
+        <w:tc>
+          <w:tcPr>
+            <w:tcW w:w="4932" w:type="dxa"/>
+            <w:tcMar>
+              <w:top w:w="75" w:type="dxa"/>
+              <w:left w:w="85" w:type="dxa"/>
+              <w:bottom w:w="75" w:type="dxa"/>
+              <w:right w:w="85" w:type="dxa"/>
+            </w:tcMar>
+            <w:vAlign w:val="center"/>
+          </w:tcPr>
+          <w:p>
+            <w:pPr>
+              <w:pStyle w:val="TableBody"/>
+            </w:pPr>
+            <w:r>
+              <w:t>保存原始</w:t>
+            </w:r>
+            <w:r>
+              <w:t xml:space="preserve"> PDF </w:t>
+            </w:r>
+            <w:r>
+              <w:t>与处理副本，使用内部对象标识、校验和和生命周期；数据库保存关系和元信息。</w:t>
+            </w:r>
+          </w:p>
+        </w:tc>
+      </w:tr>
+      <w:tr>
+        <w:trPr>
+          <w:cantSplit/>
+          <w:jc w:val="center"/>
+        </w:trPr>
+        <w:tc>
+          <w:tcPr>
+            <w:tcW w:w="1417" w:type="dxa"/>
+            <w:tcMar>
+              <w:top w:w="75" w:type="dxa"/>
+              <w:left w:w="85" w:type="dxa"/>
+              <w:bottom w:w="75" w:type="dxa"/>
+              <w:right w:w="85" w:type="dxa"/>
+            </w:tcMar>
+            <w:vAlign w:val="center"/>
+          </w:tcPr>
+          <w:p>
+            <w:pPr>
+              <w:pStyle w:val="TableBody"/>
+              <w:jc w:val="center"/>
+            </w:pPr>
+            <w:r>
+              <w:t>中间件部署</w:t>
+            </w:r>
+          </w:p>
+        </w:tc>
+        <w:tc>
+          <w:tcPr>
+            <w:tcW w:w="2438" w:type="dxa"/>
+            <w:tcMar>
+              <w:top w:w="75" w:type="dxa"/>
+              <w:left w:w="85" w:type="dxa"/>
+              <w:bottom w:w="75" w:type="dxa"/>
+              <w:right w:w="85" w:type="dxa"/>
+            </w:tcMar>
+            <w:vAlign w:val="center"/>
+          </w:tcPr>
+          <w:p>
+            <w:pPr>
+              <w:pStyle w:val="TableBody"/>
+            </w:pPr>
+            <w:r>
+              <w:t>Docker Desktop Linux Engine</w:t>
+            </w:r>
+          </w:p>
+        </w:tc>
+        <w:tc>
+          <w:tcPr>
+            <w:tcW w:w="4932" w:type="dxa"/>
+            <w:tcMar>
+              <w:top w:w="75" w:type="dxa"/>
+              <w:left w:w="85" w:type="dxa"/>
+              <w:bottom w:w="75" w:type="dxa"/>
+              <w:right w:w="85" w:type="dxa"/>
+            </w:tcMar>
+            <w:vAlign w:val="center"/>
+          </w:tcPr>
+          <w:p>
+            <w:pPr>
+              <w:pStyle w:val="TableBody"/>
+            </w:pPr>
+            <w:r>
+              <w:t>承载入口、数据库、</w:t>
+            </w:r>
+            <w:r>
+              <w:t>Redis</w:t>
             </w:r>
             <w:r>
               <w:t>、</w:t>
             </w:r>
             <w:r>
-              <w:t xml:space="preserve">Kafka </w:t>
-            </w:r>
-            <w:r>
-              <w:t>或专用监控中间件。</w:t>
+              <w:t>Elasticsearch</w:t>
+            </w:r>
+            <w:r>
+              <w:t>、</w:t>
+            </w:r>
+            <w:r>
+              <w:t xml:space="preserve">RabbitMQ </w:t>
+            </w:r>
+            <w:r>
+              <w:t>与对象存储；内部端口绑定回环、数据使用持久卷，不部署独立监控服务。</w:t>
             </w:r>
           </w:p>
         </w:tc>
@@ -14659,7 +14993,7 @@
       <w:pPr>
         <w:pStyle w:val="21"/>
       </w:pPr>
-      <w:bookmarkStart w:id="37" w:name="_Toc243418539"/>
+      <w:bookmarkStart w:id="37" w:name="_Toc243480940"/>
       <w:r>
         <w:t xml:space="preserve">5.2 </w:t>
       </w:r>
@@ -14699,54 +15033,149 @@
     </w:p>
     <w:p>
       <w:r>
-        <w:lastRenderedPageBreak/>
-        <w:t>普通操作保持一次请求返回结果的接口语义。有必要后台运行的任务由数据库记录状态，有界执行器仅提供执行名额；领取、租约和提交状态采用短事务，文件读写</w:t>
-      </w:r>
-      <w:r>
-        <w:t xml:space="preserve"> </w:t>
-      </w:r>
-      <w:r>
-        <w:t>不占用数据库行锁。敏感凭据操作在可用执行槽内直接交付；中断后重新输入，不自动重放。</w:t>
+        <w:t xml:space="preserve">11 </w:t>
+      </w:r>
+      <w:r>
+        <w:t>个核心</w:t>
+      </w:r>
+      <w:r>
+        <w:t xml:space="preserve"> PDF </w:t>
+      </w:r>
+      <w:r>
+        <w:t>接口保持一次请求返回结果的同步语义，不先入消息队列再等待。</w:t>
+      </w:r>
+      <w:r>
+        <w:t xml:space="preserve">PDF </w:t>
+      </w:r>
+      <w:r>
+        <w:t>子进程限制解析器的内存与崩溃范围，异步线程仅承担协调及</w:t>
+      </w:r>
+      <w:r>
+        <w:t xml:space="preserve"> I/O</w:t>
+      </w:r>
+      <w:r>
+        <w:t>；敏感凭据操作中断后重新输入，不自动重放。</w:t>
       </w:r>
     </w:p>
     <w:p>
       <w:r>
-        <w:t xml:space="preserve">PostgreSQL </w:t>
-      </w:r>
-      <w:r>
-        <w:t>同时承担业务持久化及必要调度，不另设</w:t>
-      </w:r>
-      <w:r>
-        <w:t xml:space="preserve"> Redis </w:t>
-      </w:r>
-      <w:r>
-        <w:t>或消息队列。</w:t>
-      </w:r>
-      <w:r>
-        <w:t xml:space="preserve">SeaweedFS </w:t>
-      </w:r>
-      <w:r>
-        <w:t>承担实际文件服务，避免文件长期依赖</w:t>
-      </w:r>
-      <w:r>
-        <w:t xml:space="preserve"> Windows </w:t>
-      </w:r>
-      <w:r>
-        <w:t>绝对路径。</w:t>
-      </w:r>
-      <w:r>
-        <w:t xml:space="preserve">PDF </w:t>
-      </w:r>
-      <w:r>
-        <w:t>子进程用于限制内存与故障范围，其运行权限、输入校验和依赖更新分别管理。</w:t>
+        <w:t>索引构建和文件清理由后台</w:t>
+      </w:r>
+      <w:r>
+        <w:t xml:space="preserve"> Worker </w:t>
+      </w:r>
+      <w:r>
+        <w:t>执行。业务事务同时写入任务与</w:t>
+      </w:r>
+      <w:r>
+        <w:t xml:space="preserve"> Outbox</w:t>
+      </w:r>
+      <w:r>
+        <w:t>；</w:t>
+      </w:r>
+      <w:r>
+        <w:t xml:space="preserve">Worker </w:t>
+      </w:r>
+      <w:r>
+        <w:t>用短租约领取</w:t>
+      </w:r>
+      <w:r>
+        <w:t xml:space="preserve"> Outbox</w:t>
+      </w:r>
+      <w:r>
+        <w:t>，收到发布确认且无路由退回后标记已投递。消费时以数据库任务标识、投递版本和递增执行令牌去重，结果与终态同事务提交后手动确认。网络等待、对象读写和</w:t>
+      </w:r>
+      <w:r>
+        <w:t xml:space="preserve"> PDF </w:t>
+      </w:r>
+      <w:r>
+        <w:t>处理不持有任务行锁。</w:t>
+      </w:r>
+    </w:p>
+    <w:p>
+      <w:r>
+        <w:t>后台任务初始租约</w:t>
+      </w:r>
+      <w:r>
+        <w:t xml:space="preserve"> 30 </w:t>
+      </w:r>
+      <w:r>
+        <w:t>秒，执行窗口</w:t>
+      </w:r>
+      <w:r>
+        <w:t xml:space="preserve"> 15 </w:t>
+      </w:r>
+      <w:r>
+        <w:t>分钟，最多尝试三次，失败按有限退避重投，永久失败进入死信队列；清理队列初始并发</w:t>
+      </w:r>
+      <w:r>
+        <w:t xml:space="preserve"> 1</w:t>
+      </w:r>
+      <w:r>
+        <w:t>、索引队列并发</w:t>
+      </w:r>
+      <w:r>
+        <w:t xml:space="preserve"> 2</w:t>
+      </w:r>
+      <w:r>
+        <w:t>，每类最多</w:t>
+      </w:r>
+      <w:r>
+        <w:t xml:space="preserve"> 128 </w:t>
+      </w:r>
+      <w:r>
+        <w:t>个未完成项。取消或租约接管撤销旧令牌的提交权。删除先写墓碑并撤销访问，再清理文件及派生索引；重复清理保持幂等。</w:t>
+      </w:r>
+    </w:p>
+    <w:p>
+      <w:r>
+        <w:t>正则搜索直接处理所选页文字，不依赖</w:t>
+      </w:r>
+      <w:r>
+        <w:t xml:space="preserve"> Elasticsearch</w:t>
+      </w:r>
+      <w:r>
+        <w:t>。</w:t>
+      </w:r>
+      <w:r>
+        <w:t>Redis</w:t>
+      </w:r>
+      <w:r>
+        <w:t>、检索或</w:t>
+      </w:r>
+      <w:r>
+        <w:t xml:space="preserve"> AMQP </w:t>
+      </w:r>
+      <w:r>
+        <w:t>故障仅影响依赖对应服务的操作，其余同步</w:t>
+      </w:r>
+      <w:r>
+        <w:t xml:space="preserve"> PDF </w:t>
+      </w:r>
+      <w:r>
+        <w:t>接口仍可执行。私有文件经</w:t>
+      </w:r>
+      <w:r>
+        <w:t xml:space="preserve"> S3 </w:t>
+      </w:r>
+      <w:r>
+        <w:t>读写，归属和对象关系由</w:t>
+      </w:r>
+      <w:r>
+        <w:t xml:space="preserve"> PostgreSQL </w:t>
+      </w:r>
+      <w:r>
+        <w:t>维护。</w:t>
       </w:r>
     </w:p>
     <w:p>
       <w:pPr>
         <w:pStyle w:val="21"/>
+        <w:pageBreakBefore/>
       </w:pPr>
-      <w:bookmarkStart w:id="38" w:name="_Toc243418540"/>
-      <w:r>
+      <w:bookmarkStart w:id="38" w:name="_Toc243480941"/>
+      <w:r>
+        <w:lastRenderedPageBreak/>
         <w:t xml:space="preserve">5.3 </w:t>
       </w:r>
       <w:r>
@@ -14766,8 +15195,8 @@
           <w:noProof/>
         </w:rPr>
         <w:drawing>
-          <wp:inline distT="0" distB="0" distL="0" distR="0" wp14:anchorId="0C0ECC20" wp14:editId="2EB9A37E">
-            <wp:extent cx="5040000" cy="3996000"/>
+          <wp:inline distT="0" distB="0" distL="0" distR="0" wp14:anchorId="09379B80" wp14:editId="35552C7B">
+            <wp:extent cx="5580000" cy="6576429"/>
             <wp:effectExtent l="0" t="0" r="0" b="0"/>
             <wp:docPr id="1" name="Picture 1"/>
             <wp:cNvGraphicFramePr>
@@ -14789,7 +15218,7 @@
                   <pic:spPr>
                     <a:xfrm>
                       <a:off x="0" y="0"/>
-                      <a:ext cx="5040000" cy="3996000"/>
+                      <a:ext cx="5580000" cy="6576429"/>
                     </a:xfrm>
                     <a:prstGeom prst="rect">
                       <a:avLst/>
@@ -14817,38 +15246,59 @@
       </w:r>
     </w:p>
     <w:p>
-      <w:r>
-        <w:t>主服务同源提供页面与</w:t>
+      <w:pPr>
+        <w:pStyle w:val="Small"/>
+      </w:pPr>
+      <w:r>
+        <w:t>浏览器通过</w:t>
+      </w:r>
+      <w:r>
+        <w:t xml:space="preserve"> Nginx </w:t>
+      </w:r>
+      <w:r>
+        <w:t>同源访问页面和</w:t>
       </w:r>
       <w:r>
         <w:t xml:space="preserve"> API</w:t>
       </w:r>
       <w:r>
-        <w:t>，数据库及</w:t>
-      </w:r>
-      <w:r>
-        <w:t xml:space="preserve"> S3 </w:t>
-      </w:r>
-      <w:r>
-        <w:t>端口只向本机开放。</w:t>
-      </w:r>
-      <w:r>
-        <w:t xml:space="preserve">Docker </w:t>
-      </w:r>
-      <w:r>
-        <w:t>承载中间件，应用使用</w:t>
-      </w:r>
-      <w:r>
-        <w:t xml:space="preserve"> Windows </w:t>
-      </w:r>
-      <w:r>
-        <w:t>原生环境。路径、端口和凭据由配置管理，构建产物可迁移至本地虚拟机；公网入口使用</w:t>
-      </w:r>
-      <w:r>
-        <w:t xml:space="preserve"> HTTPS</w:t>
-      </w:r>
-      <w:r>
-        <w:t>。</w:t>
+        <w:t>；</w:t>
+      </w:r>
+      <w:r>
+        <w:t xml:space="preserve">Web </w:t>
+      </w:r>
+      <w:r>
+        <w:t>不连接</w:t>
+      </w:r>
+      <w:r>
+        <w:t xml:space="preserve"> AMQP</w:t>
+      </w:r>
+      <w:r>
+        <w:t>，</w:t>
+      </w:r>
+      <w:r>
+        <w:t xml:space="preserve">Worker </w:t>
+      </w:r>
+      <w:r>
+        <w:t>不监听</w:t>
+      </w:r>
+      <w:r>
+        <w:t xml:space="preserve"> HTTP</w:t>
+      </w:r>
+      <w:r>
+        <w:t>。本机入口及数据服务端口绑定回环，容器通过宿主专用地址访问</w:t>
+      </w:r>
+      <w:r>
+        <w:t xml:space="preserve"> Windows Web</w:t>
+      </w:r>
+      <w:r>
+        <w:t>。路径与凭据通过配置提供；公网使用独立</w:t>
+      </w:r>
+      <w:r>
+        <w:t xml:space="preserve"> TLS</w:t>
+      </w:r>
+      <w:r>
+        <w:t>、域名允许列表与可信代理配置。单机容器和持久卷不能替代配套备份或主机级容灾。</w:t>
       </w:r>
     </w:p>
     <w:p>
@@ -14856,7 +15306,7 @@
         <w:pStyle w:val="1"/>
         <w:pageBreakBefore/>
       </w:pPr>
-      <w:bookmarkStart w:id="39" w:name="_Toc243418541"/>
+      <w:bookmarkStart w:id="39" w:name="_Toc243480942"/>
       <w:r>
         <w:lastRenderedPageBreak/>
         <w:t xml:space="preserve">6 </w:t>
@@ -14870,7 +15320,7 @@
       <w:pPr>
         <w:pStyle w:val="21"/>
       </w:pPr>
-      <w:bookmarkStart w:id="40" w:name="_Toc243418542"/>
+      <w:bookmarkStart w:id="40" w:name="_Toc243480943"/>
       <w:r>
         <w:t xml:space="preserve">6.1 </w:t>
       </w:r>
@@ -14902,7 +15352,7 @@
           <w:noProof/>
         </w:rPr>
         <w:drawing>
-          <wp:inline distT="0" distB="0" distL="0" distR="0" wp14:anchorId="22C1F7A2" wp14:editId="0645DA0C">
+          <wp:inline distT="0" distB="0" distL="0" distR="0" wp14:anchorId="1F984041" wp14:editId="2EE5C1B9">
             <wp:extent cx="5580000" cy="2630571"/>
             <wp:effectExtent l="0" t="0" r="0" b="0"/>
             <wp:docPr id="2" name="Picture 2"/>
@@ -15373,7 +15823,7 @@
         <w:pStyle w:val="21"/>
         <w:pageBreakBefore/>
       </w:pPr>
-      <w:bookmarkStart w:id="41" w:name="_Toc243418543"/>
+      <w:bookmarkStart w:id="41" w:name="_Toc243480944"/>
       <w:r>
         <w:lastRenderedPageBreak/>
         <w:t xml:space="preserve">6.2 </w:t>
@@ -15427,7 +15877,7 @@
           <w:noProof/>
         </w:rPr>
         <w:drawing>
-          <wp:inline distT="0" distB="0" distL="0" distR="0" wp14:anchorId="40CAA9D1" wp14:editId="39E19E41">
+          <wp:inline distT="0" distB="0" distL="0" distR="0" wp14:anchorId="3F45B451" wp14:editId="702366A8">
             <wp:extent cx="5580000" cy="6018429"/>
             <wp:effectExtent l="0" t="0" r="0" b="0"/>
             <wp:docPr id="3" name="Picture 3"/>
@@ -15505,7 +15955,7 @@
         <w:pStyle w:val="21"/>
         <w:pageBreakBefore/>
       </w:pPr>
-      <w:bookmarkStart w:id="42" w:name="_Toc243418544"/>
+      <w:bookmarkStart w:id="42" w:name="_Toc243480945"/>
       <w:r>
         <w:lastRenderedPageBreak/>
         <w:t xml:space="preserve">6.3 </w:t>
@@ -15541,7 +15991,7 @@
           <w:noProof/>
         </w:rPr>
         <w:drawing>
-          <wp:inline distT="0" distB="0" distL="0" distR="0" wp14:anchorId="1F80E999" wp14:editId="2F8E5F16">
+          <wp:inline distT="0" distB="0" distL="0" distR="0" wp14:anchorId="19263611" wp14:editId="69F4E78A">
             <wp:extent cx="5580000" cy="3467571"/>
             <wp:effectExtent l="0" t="0" r="0" b="0"/>
             <wp:docPr id="4" name="Picture 4"/>
@@ -16014,7 +16464,7 @@
         <w:pStyle w:val="21"/>
         <w:pageBreakBefore/>
       </w:pPr>
-      <w:bookmarkStart w:id="43" w:name="_Toc243418545"/>
+      <w:bookmarkStart w:id="43" w:name="_Toc243480946"/>
       <w:r>
         <w:lastRenderedPageBreak/>
         <w:t xml:space="preserve">6.4 </w:t>
@@ -16050,7 +16500,7 @@
           <w:noProof/>
         </w:rPr>
         <w:drawing>
-          <wp:inline distT="0" distB="0" distL="0" distR="0" wp14:anchorId="03E293EE" wp14:editId="2651C922">
+          <wp:inline distT="0" distB="0" distL="0" distR="0" wp14:anchorId="73639044" wp14:editId="4DA27990">
             <wp:extent cx="5580000" cy="3467571"/>
             <wp:effectExtent l="0" t="0" r="0" b="0"/>
             <wp:docPr id="5" name="Picture 5"/>
@@ -16522,7 +16972,7 @@
         <w:pStyle w:val="21"/>
         <w:pageBreakBefore/>
       </w:pPr>
-      <w:bookmarkStart w:id="44" w:name="_Toc243418546"/>
+      <w:bookmarkStart w:id="44" w:name="_Toc243480947"/>
       <w:r>
         <w:lastRenderedPageBreak/>
         <w:t xml:space="preserve">6.5 </w:t>
@@ -16558,7 +17008,7 @@
           <w:noProof/>
         </w:rPr>
         <w:drawing>
-          <wp:inline distT="0" distB="0" distL="0" distR="0" wp14:anchorId="2A9DF59E" wp14:editId="08E48731">
+          <wp:inline distT="0" distB="0" distL="0" distR="0" wp14:anchorId="6D1E62B3" wp14:editId="41BD619E">
             <wp:extent cx="5580000" cy="4304571"/>
             <wp:effectExtent l="0" t="0" r="0" b="0"/>
             <wp:docPr id="6" name="Picture 6"/>
@@ -17126,7 +17576,7 @@
         <w:pStyle w:val="21"/>
         <w:pageBreakBefore/>
       </w:pPr>
-      <w:bookmarkStart w:id="45" w:name="_Toc243418547"/>
+      <w:bookmarkStart w:id="45" w:name="_Toc243480948"/>
       <w:r>
         <w:lastRenderedPageBreak/>
         <w:t xml:space="preserve">6.6 </w:t>
@@ -17162,7 +17612,7 @@
           <w:noProof/>
         </w:rPr>
         <w:drawing>
-          <wp:inline distT="0" distB="0" distL="0" distR="0" wp14:anchorId="42231FA5" wp14:editId="5881C34C">
+          <wp:inline distT="0" distB="0" distL="0" distR="0" wp14:anchorId="1956B627" wp14:editId="2E96C226">
             <wp:extent cx="5580000" cy="2630571"/>
             <wp:effectExtent l="0" t="0" r="0" b="0"/>
             <wp:docPr id="7" name="Picture 7"/>
@@ -17544,7 +17994,7 @@
         <w:pStyle w:val="1"/>
         <w:pageBreakBefore/>
       </w:pPr>
-      <w:bookmarkStart w:id="46" w:name="_Toc243418548"/>
+      <w:bookmarkStart w:id="46" w:name="_Toc243480949"/>
       <w:r>
         <w:lastRenderedPageBreak/>
         <w:t xml:space="preserve">7 </w:t>
@@ -17558,7 +18008,7 @@
       <w:pPr>
         <w:pStyle w:val="21"/>
       </w:pPr>
-      <w:bookmarkStart w:id="47" w:name="_Toc243418549"/>
+      <w:bookmarkStart w:id="47" w:name="_Toc243480950"/>
       <w:r>
         <w:t xml:space="preserve">7.1 </w:t>
       </w:r>
@@ -17590,7 +18040,7 @@
           <w:noProof/>
         </w:rPr>
         <w:drawing>
-          <wp:inline distT="0" distB="0" distL="0" distR="0" wp14:anchorId="052E29F5" wp14:editId="570C4C55">
+          <wp:inline distT="0" distB="0" distL="0" distR="0" wp14:anchorId="68A2E652" wp14:editId="4C6AD2AC">
             <wp:extent cx="5580000" cy="5938714"/>
             <wp:effectExtent l="0" t="0" r="0" b="0"/>
             <wp:docPr id="8" name="Picture 8"/>
@@ -17673,7 +18123,7 @@
       <w:pPr>
         <w:pStyle w:val="21"/>
       </w:pPr>
-      <w:bookmarkStart w:id="48" w:name="_Toc243418550"/>
+      <w:bookmarkStart w:id="48" w:name="_Toc243480951"/>
       <w:r>
         <w:lastRenderedPageBreak/>
         <w:t xml:space="preserve">7.2 </w:t>
@@ -18822,7 +19272,7 @@
         <w:pStyle w:val="21"/>
         <w:pageBreakBefore/>
       </w:pPr>
-      <w:bookmarkStart w:id="49" w:name="_Toc243418551"/>
+      <w:bookmarkStart w:id="49" w:name="_Toc243480952"/>
       <w:r>
         <w:lastRenderedPageBreak/>
         <w:t xml:space="preserve">7.3 </w:t>
@@ -18844,7 +19294,7 @@
           <w:noProof/>
         </w:rPr>
         <w:drawing>
-          <wp:inline distT="0" distB="0" distL="0" distR="0" wp14:anchorId="0DD938CA" wp14:editId="6164640A">
+          <wp:inline distT="0" distB="0" distL="0" distR="0" wp14:anchorId="3920E621" wp14:editId="3E294B11">
             <wp:extent cx="5580000" cy="3871125"/>
             <wp:effectExtent l="0" t="0" r="0" b="0"/>
             <wp:docPr id="9" name="Picture 9"/>
@@ -19198,7 +19648,7 @@
         <w:pStyle w:val="21"/>
         <w:pageBreakBefore/>
       </w:pPr>
-      <w:bookmarkStart w:id="50" w:name="_Toc243418552"/>
+      <w:bookmarkStart w:id="50" w:name="_Toc243480953"/>
       <w:r>
         <w:lastRenderedPageBreak/>
         <w:t xml:space="preserve">7.4 </w:t>
@@ -19220,7 +19670,7 @@
           <w:noProof/>
         </w:rPr>
         <w:drawing>
-          <wp:inline distT="0" distB="0" distL="0" distR="0" wp14:anchorId="635EB87C" wp14:editId="43D8599E">
+          <wp:inline distT="0" distB="0" distL="0" distR="0" wp14:anchorId="5131A52A" wp14:editId="789A1BDD">
             <wp:extent cx="5580000" cy="3871125"/>
             <wp:effectExtent l="0" t="0" r="0" b="0"/>
             <wp:docPr id="10" name="Picture 10"/>
@@ -19568,7 +20018,7 @@
         <w:pStyle w:val="1"/>
         <w:pageBreakBefore/>
       </w:pPr>
-      <w:bookmarkStart w:id="51" w:name="_Toc243418553"/>
+      <w:bookmarkStart w:id="51" w:name="_Toc243480954"/>
       <w:r>
         <w:lastRenderedPageBreak/>
         <w:t xml:space="preserve">8 </w:t>
@@ -19588,7 +20038,7 @@
       <w:pPr>
         <w:pStyle w:val="21"/>
       </w:pPr>
-      <w:bookmarkStart w:id="52" w:name="_Toc243418554"/>
+      <w:bookmarkStart w:id="52" w:name="_Toc243480955"/>
       <w:r>
         <w:t xml:space="preserve">8.1 </w:t>
       </w:r>
@@ -20770,7 +21220,7 @@
       <w:pPr>
         <w:pStyle w:val="21"/>
       </w:pPr>
-      <w:bookmarkStart w:id="53" w:name="_Toc243418555"/>
+      <w:bookmarkStart w:id="53" w:name="_Toc243480956"/>
       <w:r>
         <w:t xml:space="preserve">8.2 </w:t>
       </w:r>
@@ -21621,7 +22071,7 @@
       <w:pPr>
         <w:pStyle w:val="21"/>
       </w:pPr>
-      <w:bookmarkStart w:id="54" w:name="_Toc243418556"/>
+      <w:bookmarkStart w:id="54" w:name="_Toc243480957"/>
       <w:r>
         <w:t xml:space="preserve">8.3 </w:t>
       </w:r>
@@ -22354,7 +22804,7 @@
       <w:pPr>
         <w:pStyle w:val="1"/>
       </w:pPr>
-      <w:bookmarkStart w:id="55" w:name="_Toc243418557"/>
+      <w:bookmarkStart w:id="55" w:name="_Toc243480958"/>
       <w:r>
         <w:t xml:space="preserve">9 </w:t>
       </w:r>
@@ -22367,7 +22817,7 @@
       <w:pPr>
         <w:pStyle w:val="21"/>
       </w:pPr>
-      <w:bookmarkStart w:id="56" w:name="_Toc243418558"/>
+      <w:bookmarkStart w:id="56" w:name="_Toc243480959"/>
       <w:r>
         <w:t xml:space="preserve">9.1 </w:t>
       </w:r>
@@ -22426,7 +22876,7 @@
       <w:pPr>
         <w:pStyle w:val="21"/>
       </w:pPr>
-      <w:bookmarkStart w:id="57" w:name="_Toc243418559"/>
+      <w:bookmarkStart w:id="57" w:name="_Toc243480960"/>
       <w:r>
         <w:t xml:space="preserve">9.2 </w:t>
       </w:r>
@@ -25081,7 +25531,7 @@
       <w:pPr>
         <w:pStyle w:val="21"/>
       </w:pPr>
-      <w:bookmarkStart w:id="58" w:name="_Toc243418560"/>
+      <w:bookmarkStart w:id="58" w:name="_Toc243480961"/>
       <w:r>
         <w:t xml:space="preserve">9.3 </w:t>
       </w:r>
@@ -25692,7 +26142,7 @@
         <w:pStyle w:val="1"/>
         <w:pageBreakBefore/>
       </w:pPr>
-      <w:bookmarkStart w:id="59" w:name="_Toc243418561"/>
+      <w:bookmarkStart w:id="59" w:name="_Toc243480962"/>
       <w:r>
         <w:lastRenderedPageBreak/>
         <w:t xml:space="preserve">10 </w:t>
@@ -25876,6 +26326,82 @@
       </w:pPr>
       <w:r>
         <w:t>https://spec.openapis.org/oas/v3.0.3</w:t>
+      </w:r>
+    </w:p>
+    <w:p>
+      <w:pPr>
+        <w:keepNext/>
+      </w:pPr>
+      <w:r>
+        <w:t xml:space="preserve">R09 Spring Session Redis </w:t>
+      </w:r>
+      <w:r>
+        <w:t>配置</w:t>
+      </w:r>
+    </w:p>
+    <w:p>
+      <w:pPr>
+        <w:pStyle w:val="Small"/>
+      </w:pPr>
+      <w:r>
+        <w:t>https://docs.spring.io/spring-session/reference/configuration/redis.html</w:t>
+      </w:r>
+    </w:p>
+    <w:p>
+      <w:pPr>
+        <w:keepNext/>
+      </w:pPr>
+      <w:r>
+        <w:t xml:space="preserve">R10 RabbitMQ </w:t>
+      </w:r>
+      <w:r>
+        <w:t>发布确认与消费确认</w:t>
+      </w:r>
+    </w:p>
+    <w:p>
+      <w:pPr>
+        <w:pStyle w:val="Small"/>
+      </w:pPr>
+      <w:r>
+        <w:t>https://www.rabbitmq.com/docs/confirms</w:t>
+      </w:r>
+    </w:p>
+    <w:p>
+      <w:pPr>
+        <w:keepNext/>
+      </w:pPr>
+      <w:r>
+        <w:t xml:space="preserve">R11 Elasticsearch </w:t>
+      </w:r>
+      <w:r>
+        <w:t>索引别名</w:t>
+      </w:r>
+    </w:p>
+    <w:p>
+      <w:pPr>
+        <w:pStyle w:val="Small"/>
+      </w:pPr>
+      <w:r>
+        <w:t>https://www.elastic.co/docs/manage-data/data-store/aliases</w:t>
+      </w:r>
+    </w:p>
+    <w:p>
+      <w:pPr>
+        <w:keepNext/>
+      </w:pPr>
+      <w:r>
+        <w:t xml:space="preserve">R12 Nginx HTTP </w:t>
+      </w:r>
+      <w:r>
+        <w:t>代理模块</w:t>
+      </w:r>
+    </w:p>
+    <w:p>
+      <w:pPr>
+        <w:pStyle w:val="Small"/>
+      </w:pPr>
+      <w:r>
+        <w:t>https://nginx.org/en/docs/http/ngx_http_proxy_module.html</w:t>
       </w:r>
     </w:p>
     <w:sectPr>
@@ -26174,31 +26700,31 @@
       </w:rPr>
     </w:lvl>
   </w:abstractNum>
-  <w:num w:numId="1" w16cid:durableId="624191582">
+  <w:num w:numId="1" w16cid:durableId="301079907">
     <w:abstractNumId w:val="8"/>
   </w:num>
-  <w:num w:numId="2" w16cid:durableId="1385449789">
+  <w:num w:numId="2" w16cid:durableId="430244793">
     <w:abstractNumId w:val="6"/>
   </w:num>
-  <w:num w:numId="3" w16cid:durableId="544829592">
+  <w:num w:numId="3" w16cid:durableId="135071976">
     <w:abstractNumId w:val="5"/>
   </w:num>
-  <w:num w:numId="4" w16cid:durableId="2050371942">
+  <w:num w:numId="4" w16cid:durableId="1546335695">
     <w:abstractNumId w:val="4"/>
   </w:num>
-  <w:num w:numId="5" w16cid:durableId="509297015">
+  <w:num w:numId="5" w16cid:durableId="24066108">
     <w:abstractNumId w:val="7"/>
   </w:num>
-  <w:num w:numId="6" w16cid:durableId="824247404">
+  <w:num w:numId="6" w16cid:durableId="1857385716">
     <w:abstractNumId w:val="3"/>
   </w:num>
-  <w:num w:numId="7" w16cid:durableId="393510239">
+  <w:num w:numId="7" w16cid:durableId="431434424">
     <w:abstractNumId w:val="2"/>
   </w:num>
-  <w:num w:numId="8" w16cid:durableId="104232709">
+  <w:num w:numId="8" w16cid:durableId="1023049240">
     <w:abstractNumId w:val="1"/>
   </w:num>
-  <w:num w:numId="9" w16cid:durableId="721321594">
+  <w:num w:numId="9" w16cid:durableId="1942882430">
     <w:abstractNumId w:val="0"/>
   </w:num>
 </w:numbering>
@@ -37735,7 +38261,7 @@
     <w:autoRedefine/>
     <w:uiPriority w:val="39"/>
     <w:unhideWhenUsed/>
-    <w:rsid w:val="0098431A"/>
+    <w:rsid w:val="00C22DE2"/>
   </w:style>
   <w:style w:type="paragraph" w:styleId="TOC2">
     <w:name w:val="toc 2"/>
@@ -37744,7 +38270,7 @@
     <w:autoRedefine/>
     <w:uiPriority w:val="39"/>
     <w:unhideWhenUsed/>
-    <w:rsid w:val="0098431A"/>
+    <w:rsid w:val="00C22DE2"/>
     <w:pPr>
       <w:ind w:leftChars="200" w:left="420"/>
     </w:pPr>
@@ -37754,7 +38280,7 @@
     <w:basedOn w:val="a2"/>
     <w:uiPriority w:val="99"/>
     <w:unhideWhenUsed/>
-    <w:rsid w:val="0098431A"/>
+    <w:rsid w:val="00C22DE2"/>
     <w:rPr>
       <w:color w:val="000000"/>
       <w:u w:val="none"/>
@@ -37766,7 +38292,7 @@
     <w:uiPriority w:val="99"/>
     <w:semiHidden/>
     <w:unhideWhenUsed/>
-    <w:rsid w:val="0098431A"/>
+    <w:rsid w:val="00C22DE2"/>
     <w:rPr>
       <w:color w:val="000000"/>
       <w:u w:val="none"/>

</xml_diff>